<commit_message>
Apply external review of the manuscript
Cite the framework paper and explain how this paper differs from it. State
that the analysis plan has no public timestamp from before the results.
Count the Sentinel-1 coverage check once, giving 18 of 22 required checks.
Number the questions, fix the equation, define effective observations, and
report the satellite check and the limits of randomisation inference in full.
Name the outliers in Fig. 4a, flag districts with a small Boro base, add
intervals and counts to Fig. 6, and add the data checks and the literature
search as appendices. Correct the reference list.
</commit_message>
<xml_diff>
--- a/paper/Manuscript.docx
+++ b/paper/Manuscript.docx
@@ -89,7 +89,7 @@
         <w:pStyle w:val="FirstParagraph"/>
       </w:pPr>
       <w:r>
-        <w:t xml:space="preserve">Flood losses to crops are often measured through yield, but official yield is estimated on harvested fields, so a destroyed field may leave no trace in it. We tested this for Boro rice in Bangladesh, using a validated panel of 64 districts for 2011–2025, flood fractions from Sentinel-1 and JRC, and an analysis plan fixed in advance. In the 2017 flash flood, harvested area in the seven haor districts fell by 31 % relative to other districts, while yield changed by −0.9 %. In Sunamganj, area fell by 72 % and yield by 0.8 %. A satellite crop-loss measure and published damage figures support these losses. The general result was only suggestive under the plan’s rule: the area effect per 10 points of flood was −21.6 % with Sentinel-1 and −4.7 % with JRC, and it disappeared without 2016 and 2017. The 2016 and 2022 floods left no fall in area. An exploratory analysis suggests that timing matters, but rests on 2017. Yield alone can therefore miss the largest losses, so damage assessment should also track harvested area and production.</w:t>
+        <w:t xml:space="preserve">Flood losses to crops are often measured through yield, but official yield is estimated on harvested fields, so a destroyed field may leave no trace in it. We tested this for Boro rice in Bangladesh, using a validated panel of 64 districts for 2011–2025, flood fractions from Sentinel-1 and JRC, and a written analysis plan. In the 2017 flash flood, harvested area in the seven haor districts fell by 31 % relative to other districts, while yield changed by −0.9 %. In Sunamganj, area fell by 72 % and yield by 0.8 %. A satellite crop-loss measure and published damage figures support these losses. The general result was only suggestive under the plan’s rule: the area effect per 10 points of flood was −21.6 % with Sentinel-1 and −4.7 % with JRC, and it disappeared without 2016 and 2017. The 2016 and 2022 floods left no fall in area. An exploratory analysis suggests that timing matters, but rests on 2017. Yield alone can therefore miss the largest losses, so damage assessment should also track harvested area and production.</w:t>
       </w:r>
     </w:p>
     <w:p>
@@ -129,7 +129,7 @@
         </w:numPr>
       </w:pPr>
       <w:r>
-        <w:t xml:space="preserve">Code, notebooks and outputs: https://github.com/TasMumu/bd-boro-flood-risk [authors: make the repository public, archive a release and give its DOI here before submission]</w:t>
+        <w:t xml:space="preserve">Code, notebooks and outputs: https://github.com/TasMumu/bd-boro-flood-risk [authors: add the Zenodo DOI of the archived release]</w:t>
       </w:r>
     </w:p>
     <w:p>
@@ -141,7 +141,7 @@
         </w:numPr>
       </w:pPr>
       <w:r>
-        <w:t xml:space="preserve">Data: the panel of Mumu and Karim (2026), archived at https://doi.org/10.5281/zenodo.23795046. The Earth Engine extracts used here are included with the code</w:t>
+        <w:t xml:space="preserve">Data: the panel archived at https://doi.org/10.5281/zenodo.23795046 (Mumu and Karim, 2026b). The Earth Engine extracts used here are included with the code</w:t>
       </w:r>
     </w:p>
     <w:p>
@@ -171,7 +171,7 @@
         <w:pStyle w:val="FirstParagraph"/>
       </w:pPr>
       <w:r>
-        <w:t xml:space="preserve">Assessing what a flood costs a farming region depends on what is measured. Most research on weather and crops has focused on yield (Cui, 2020; Wei and Davis, 2022), and yield is the natural outcome when a flood reduces grain per hectare. But a flood can also destroy a crop outright. If official yield is measured only on fields that were harvested, a destroyed field does not lower the yield estimate. It simply leaves the harvested area. Disaster assessments and research that look at yield alone could then miss the losses that matter most.</w:t>
+        <w:t xml:space="preserve">Assessing what a flood costs a farming region depends on what is measured. Most research on weather and crops has focused on yield (Cui, 2020; Wei et al., 2023), and yield is the natural outcome when a flood reduces grain per hectare. But a flood can also destroy a crop outright. If official yield is measured only on fields that were harvested, a destroyed field does not lower the yield estimate. It simply leaves the harvested area. Disaster assessments and research that look at yield alone could then miss the losses that matter most.</w:t>
       </w:r>
     </w:p>
     <w:p>
@@ -179,7 +179,7 @@
         <w:pStyle w:val="BodyText"/>
       </w:pPr>
       <w:r>
-        <w:t xml:space="preserve">The evidence on this point is mixed, and the answer appears to depend on the setting. Globally, drought reduced cereal production through both area and yield, extreme heat mainly through yield, and no effect of floods could be identified in national data (Lesk et al., 2016). A recent global study reports that submergence for more than a week reduces annual rice yield by 4.3 % (Li et al., 2025). In the United States, harvested ratios fall under extreme heat (Cui, 2020), and area-related disruptions explain at least as much maize production instability as yield (Wei and Davis, 2022). In Kansas wheat, however, losses came from yield and not from abandonment (Obembe et al., 2021). For rice, typhoons reduced provincial production in a Philippine panel (Blanc and Strobl, 2016).</w:t>
+        <w:t xml:space="preserve">The evidence on this point is mixed, and the answer appears to depend on the setting. Globally, drought reduced cereal production through both area and yield, extreme heat mainly through yield, and no effect of floods could be identified in national data (Lesk et al., 2016). A recent global study reports that submergence for more than a week reduces annual rice yield by 4.3 % (Li et al., 2025). In the United States, harvested ratios fall under extreme heat (Cui, 2020), and shocks in planted and harvested area coincided with more than half of the production shocks across seven crops, although yield contributed more for some of them (Wei et al., 2023). In Kansas wheat, however, losses came from yield and not from abandonment (Obembe et al., 2021). For rice, typhoons reduced provincial production in a Philippine panel (Blanc and Strobl, 2016).</w:t>
       </w:r>
     </w:p>
     <w:p>
@@ -195,7 +195,7 @@
         <w:pStyle w:val="BodyText"/>
       </w:pPr>
       <w:r>
-        <w:t xml:space="preserve">We asked five questions. Do flash floods reduce Boro production through harvested area rather than yield? Do monsoon floods, which come before planting, act differently? Are flood effects concentrated in the haor? Why does the vegetation index NDVI not explain yield within a district? And where is risk concentrated, and how stable is that ranking?</w:t>
+        <w:t xml:space="preserve">We asked five questions. Q1: do flash floods reduce Boro production through harvested area rather than yield? Q2: do monsoon floods, which come before planting, act differently? Q3: are flood effects concentrated in the haor? Q4: does the vegetation index NDVI explain yield within a district? Q5: where is risk concentrated, and how stable is that ranking?</w:t>
       </w:r>
     </w:p>
     <w:p>
@@ -203,7 +203,7 @@
         <w:pStyle w:val="BodyText"/>
       </w:pPr>
       <w:r>
-        <w:t xml:space="preserve">The analysis makes three contributions. It uses a validated panel of all 64 districts, with values printed by BBS and no modelled yields (Mumu and Karim, 2026). It checks official statistics against evidence independent of them, namely two flood records, a satellite measure of crop loss, and published damage figures. And its questions, models and pass rules were fixed before the models were run, so that a weak result is reported as weak. That turned out to matter: the area effect is clear for the 2017 flood, but the evidence for a general rule is only suggestive.</w:t>
+        <w:t xml:space="preserve">The analysis makes three contributions. It uses a validated panel of all 64 districts, with values printed by BBS and no modelled yields (Mumu and Karim, 2026a). It checks official statistics against evidence independent of them, namely two flood records, a satellite measure of crop loss, and published damage figures. And its questions, models and pass rules were written down before the models were run, so that a weak result is reported as weak (Section 4.1 gives the limits of this claim). That turned out to matter: the area effect is clear for the 2017 flood, but the evidence for a general rule is only suggestive.</w:t>
       </w:r>
     </w:p>
     <w:bookmarkEnd w:id="11"/>
@@ -266,7 +266,7 @@
         <w:pStyle w:val="FirstParagraph"/>
       </w:pPr>
       <w:r>
-        <w:t xml:space="preserve">Table 1 compares the closest studies with this one. We found no study that uses a multi-year district panel with satellite flood data to split Boro flash-flood losses into harvested area and yield. This rests on a documented search of 1,383 records and on abstracts rather than full texts. One recent paper on monsoon floods and crop production in Bangladesh (Rahman et al., 2025) could be read only in part.</w:t>
+        <w:t xml:space="preserve">Table 1 compares the closest studies with this one. We found no study that uses a multi-year district panel with satellite flood data to split Boro flash-flood losses into harvested area and yield. This rests on a documented search of 1,383 records, screened on titles and abstracts (Appendix B). A recent study addresses monsoon flood disasters and crop production in Bangladesh (Rahman et al., 2025).</w:t>
       </w:r>
     </w:p>
     <w:p>
@@ -774,7 +774,7 @@
     </w:tbl>
     <w:bookmarkEnd w:id="14"/>
     <w:bookmarkEnd w:id="15"/>
-    <w:bookmarkStart w:id="19" w:name="data"/>
+    <w:bookmarkStart w:id="20" w:name="data"/>
     <w:p>
       <w:pPr>
         <w:pStyle w:val="Heading1"/>
@@ -797,7 +797,7 @@
         <w:pStyle w:val="FirstParagraph"/>
       </w:pPr>
       <w:r>
-        <w:t xml:space="preserve">The analysis uses the Gold panel of Mumu and Karim (2026): 960 district-years for all 64 districts and harvest years 2011–2025, where harvest year t is the crop sown in November of t−1 and harvested in April–May of t. Boro harvested area, yield and production are values printed in the BBS yearbooks, each with its edition and page, and no value is modelled or filled. Weather comes from ERA5-Land (Muñoz-Sabater et al., 2021). Flood fractions come from the monthly surface water record of the Joint Research Centre (JRC) (Pekel et al., 2016) and from Sentinel-1 radar (Torres et al., 2012), and are kept as separate records. Table 2 lists the sources. The seven haor districts are Sunamganj, Habiganj, Netrokona, Kishoreganj, Sylhet, Moulvibazar and Brahmanbaria, a list fixed before the models were run. They produced 17.5 % of Boro over the period.</w:t>
+        <w:t xml:space="preserve">The analysis uses the panel built and tested in the framework paper (Mumu and Karim, 2026a) and archived separately (Mumu and Karim, 2026b): 960 district-years for all 64 districts and harvest years 2011–2025, where harvest year t is the crop sown in November of t−1 and harvested in April–May of t. Boro harvested area, yield and production are values printed in the BBS yearbooks, each with its edition and page, and no value is modelled or filled. Weather comes from ERA5-Land (Muñoz-Sabater et al., 2021). Flood fractions come from the monthly surface water record of the Joint Research Centre (JRC) (Pekel et al., 2016) and from Sentinel-1 radar (Torres et al., 2012), and are kept as separate records. Table 2 lists the sources. The seven haor districts are Sunamganj, Habiganj, Netrokona, Kishoreganj, Sylhet, Moulvibazar and Brahmanbaria, a list fixed before the models were run. They produced 17.5 % of Boro over the period.</w:t>
       </w:r>
     </w:p>
     <w:p>
@@ -889,7 +889,7 @@
               <w:pStyle w:val="Compact"/>
             </w:pPr>
             <w:r>
-              <w:t xml:space="preserve">BBS yearbooks, through the Paper 1 panel</w:t>
+              <w:t xml:space="preserve">BBS yearbooks, from the panel of Mumu and Karim (2026b)</w:t>
             </w:r>
           </w:p>
         </w:tc>
@@ -1110,13 +1110,31 @@
       </w:r>
     </w:p>
     <w:bookmarkEnd w:id="16"/>
-    <w:bookmarkStart w:id="17" w:name="new-variables"/>
+    <w:bookmarkStart w:id="17" w:name="relation-to-the-framework-paper"/>
     <w:p>
       <w:pPr>
         <w:pStyle w:val="Heading2"/>
       </w:pPr>
       <w:r>
-        <w:t xml:space="preserve">3.2 New variables</w:t>
+        <w:t xml:space="preserve">3.2 Relation to the framework paper</w:t>
+      </w:r>
+    </w:p>
+    <w:p>
+      <w:pPr>
+        <w:pStyle w:val="FirstParagraph"/>
+      </w:pPr>
+      <w:r>
+        <w:t xml:space="preserve">The framework paper describes how the panel was built and tested, and uses the 2017 flood and a simple index only as brief examples (Mumu and Karim, 2026a). This paper asks a different question, and adds new variables, three designs and independent checks. Two differences need explaining. For Sunamganj in 2017, the framework paper reports −71.5 % area and −0.1 % yield against the mean of 2015–2016. Here the baseline is the mean of 2015 and 2018, giving −72.4 % and −0.8 %, because 2016 was itself a flood year. The risk index also differs. The framework paper’s illustrative index has five equally weighted components with whole-district JRC flood. Ours has seven components grouped as exposure and sensitivity, flood on Boro land from both records, and stage-specific heat and cold, and it is tested under many combinations of choices, so the two top tens differ.</w:t>
+      </w:r>
+    </w:p>
+    <w:bookmarkEnd w:id="17"/>
+    <w:bookmarkStart w:id="18" w:name="new-variables"/>
+    <w:p>
+      <w:pPr>
+        <w:pStyle w:val="Heading2"/>
+      </w:pPr>
+      <w:r>
+        <w:t xml:space="preserve">3.3 New variables</w:t>
       </w:r>
     </w:p>
     <w:p>
@@ -1199,14 +1217,14 @@
         <w:t xml:space="preserve">We also computed flood fractions at water thresholds of −16 and −20 dB, Sentinel-1 scene counts, hot days above 35 °C from mid-March to April (Jagadish et al., 2007), and days below 20 °C from mid-February to March. The cold threshold is provisional. Adaptive capacity is not covered, because no published district series was assembled, and nothing was estimated in its place.</w:t>
       </w:r>
     </w:p>
-    <w:bookmarkEnd w:id="17"/>
-    <w:bookmarkStart w:id="18" w:name="data-checks"/>
+    <w:bookmarkEnd w:id="18"/>
+    <w:bookmarkStart w:id="19" w:name="data-checks"/>
     <w:p>
       <w:pPr>
         <w:pStyle w:val="Heading2"/>
       </w:pPr>
       <w:r>
-        <w:t xml:space="preserve">3.3 Data checks</w:t>
+        <w:t xml:space="preserve">3.4 Data checks</w:t>
       </w:r>
     </w:p>
     <w:p>
@@ -1214,7 +1232,7 @@
         <w:pStyle w:val="FirstParagraph"/>
       </w:pPr>
       <w:r>
-        <w:t xml:space="preserve">All 18 checks passed. The new code recomputed the published flood fractions of the panel, and the largest difference was below 10</w:t>
+        <w:t xml:space="preserve">All 18 checks passed (Table A.3). The new code recomputed the published flood fractions of the panel, and the largest difference was below 10</w:t>
       </w:r>
       <w:r>
         <w:rPr>
@@ -1226,9 +1244,9 @@
         <w:t xml:space="preserve">, so the variants are computed by verified code. The panel’s checksum matches the archived version.</w:t>
       </w:r>
     </w:p>
-    <w:bookmarkEnd w:id="18"/>
     <w:bookmarkEnd w:id="19"/>
-    <w:bookmarkStart w:id="26" w:name="methods"/>
+    <w:bookmarkEnd w:id="20"/>
+    <w:bookmarkStart w:id="27" w:name="methods"/>
     <w:p>
       <w:pPr>
         <w:pStyle w:val="Heading1"/>
@@ -1237,7 +1255,7 @@
         <w:t xml:space="preserve">4. Methods</w:t>
       </w:r>
     </w:p>
-    <w:bookmarkStart w:id="20" w:name="analysis-plan"/>
+    <w:bookmarkStart w:id="21" w:name="analysis-plan"/>
     <w:p>
       <w:pPr>
         <w:pStyle w:val="Heading2"/>
@@ -1251,11 +1269,11 @@
         <w:pStyle w:val="FirstParagraph"/>
       </w:pPr>
       <w:r>
-        <w:t xml:space="preserve">Questions, models, pass rules and the bound for a negligible yield effect were fixed in a written plan before any new model was run. The basic models in the framework paper (Mumu and Karim, 2026) had been seen and count as exploratory. Two changes were made before the outcome models were run, based on flood and mask data and BBS area between districts: flood fractions on rice land use a stable mask built here, because the yearly mask proved noisy and published rice maps do not cover the period; and Sentinel-1 early and late windows use half-month medians, because a single monthly median diluted a flood arriving midway. After the planned results were seen, we added the analyses in Section 5.6 and one extra synthetic-control test. These are labelled as exploratory, and they do not change the verdict.</w:t>
-      </w:r>
-    </w:p>
-    <w:bookmarkEnd w:id="20"/>
-    <w:bookmarkStart w:id="21" w:name="flood-models"/>
+        <w:t xml:space="preserve">Questions, models, pass rules and the bound for a negligible yield effect were written in a plan before any new model was run. The plan was not registered with a public timestamp. It entered version control together with the results, in the first commit of the repository (54ca10f, 31 October 2026), so readers cannot verify the order independently, and this study should not be read as preregistered. The plan and its log of changes are in the repository. The basic models in the framework paper (Mumu and Karim, 2026a) had been seen and count as exploratory. Two changes were made before the outcome models were run, based on flood and mask data and BBS area between districts: flood fractions on rice land use a stable mask built here, because the yearly mask proved noisy and published rice maps do not cover the period; and Sentinel-1 early and late windows use half-month medians, because a single monthly median diluted a flood arriving midway. After the planned results were seen, we added the analyses in Section 5.6, one extra synthetic-control test, a variant without districts with a small Boro base, and a variant without Chandpur. These are labelled as exploratory, and they do not change the verdict.</w:t>
+      </w:r>
+    </w:p>
+    <w:bookmarkEnd w:id="21"/>
+    <w:bookmarkStart w:id="22" w:name="flood-models"/>
     <w:p>
       <w:pPr>
         <w:pStyle w:val="Heading2"/>
@@ -1356,7 +1374,7 @@
             </m:rPr>
             <m:t>+</m:t>
           </m:r>
-          <m:sSub>
+          <m:sSubSup>
             <m:e>
               <m:r>
                 <m:rPr>
@@ -1366,26 +1384,22 @@
               </m:r>
             </m:e>
             <m:sub>
-              <m:sSup>
-                <m:e>
-                  <m:r>
-                    <m:t>i</m:t>
-                  </m:r>
-                  <m:r>
-                    <m:t>t</m:t>
-                  </m:r>
-                </m:e>
-                <m:sup>
-                  <m:r>
-                    <m:rPr>
-                      <m:sty m:val="p"/>
-                    </m:rPr>
-                    <m:t>′</m:t>
-                  </m:r>
-                </m:sup>
-              </m:sSup>
+              <m:r>
+                <m:t>i</m:t>
+              </m:r>
+              <m:r>
+                <m:t>t</m:t>
+              </m:r>
             </m:sub>
-          </m:sSub>
+            <m:sup>
+              <m:r>
+                <m:rPr>
+                  <m:sty m:val="p"/>
+                </m:rPr>
+                <m:t>′</m:t>
+              </m:r>
+            </m:sup>
+          </m:sSubSup>
           <m:r>
             <m:rPr>
               <m:sty m:val="b"/>
@@ -1482,8 +1496,8 @@
         <w:t xml:space="preserve">holds mean temperature, precipitation and hot days, and α and τ are district and year effects. Since production is area times yield, the area and yield effects must add up to the production effect; the largest gap was below 0.0001 log points. Effects are reported in per cent. This is the standard panel approach to weather effects (Hsiang, 2016; Blanc and Schlenker, 2017; Auffhammer et al., 2013). Results are estimates under the stated assumptions: floods are not randomly assigned, and we avoid causal language.</w:t>
       </w:r>
     </w:p>
-    <w:bookmarkEnd w:id="21"/>
-    <w:bookmarkStart w:id="22" w:name="three-designs-for-flash-floods"/>
+    <w:bookmarkEnd w:id="22"/>
+    <w:bookmarkStart w:id="23" w:name="three-designs-for-flash-floods"/>
     <w:p>
       <w:pPr>
         <w:pStyle w:val="Heading2"/>
@@ -1500,8 +1514,8 @@
         <w:t xml:space="preserve">Flash floods were studied in three ways that must point the same way: the dose-response model above; a year-by-year comparison of haor and other districts relative to 2015, the last year before the two largest floods; and synthetic control (Abadie, 2021) for the five most flooded districts in 2017, where a weighted mix of non-haor districts matches each district’s path in 2011–2015.</w:t>
       </w:r>
     </w:p>
-    <w:bookmarkEnd w:id="22"/>
-    <w:bookmarkStart w:id="23" w:name="uncertainty"/>
+    <w:bookmarkEnd w:id="23"/>
+    <w:bookmarkStart w:id="24" w:name="uncertainty"/>
     <w:p>
       <w:pPr>
         <w:pStyle w:val="Heading2"/>
@@ -1515,11 +1529,11 @@
         <w:pStyle w:val="FirstParagraph"/>
       </w:pPr>
       <w:r>
-        <w:t xml:space="preserve">Few districts are treated and they are atypical, a setting in which clustered errors and the wild bootstrap can fail, and randomisation inference has limits (Conley and Taber, 2011; MacKinnon and Webb, 2017, 2018, 2020). So no single method was relied on. Every main estimate is reported with errors clustered by district, Driscoll–Kraay errors (Driscoll and Kraay, 1998), Conley spatial errors (Conley, 1999) with a 100 km cut-off and two years of serial correlation, and randomisation inference that reassigns whole flood years across the panel, keeping each flood’s real spatial pattern. With T years, one event alone cannot reach a p-value below 1/T, about 0.10 here, and two events below about 0.01.</w:t>
-      </w:r>
-    </w:p>
-    <w:bookmarkEnd w:id="23"/>
-    <w:bookmarkStart w:id="24" w:name="how-results-were-judged"/>
+        <w:t xml:space="preserve">Few districts are treated and they are atypical, a setting in which clustered errors and the wild bootstrap can fail, and randomisation inference has limits (Conley and Taber, 2011; MacKinnon and Webb, 2017, 2018, 2020). So no single method was relied on. Every main estimate is reported with errors clustered by district, Driscoll–Kraay errors (Driscoll and Kraay, 1998), Conley spatial errors (Conley, 1999) with a 100 km cut-off and two years of serial correlation, and randomisation inference that reassigns whole flood years across the panel, keeping each flood’s real spatial pattern. With T years, one event alone cannot reach a p-value below 1/T, about 0.10 here, and two events below about 0.01. These limits apply only when one or two years carry all the variation. Because the flood pattern of every year is permuted, smaller p-values are possible when several years contribute, as in Table 4.</w:t>
+      </w:r>
+    </w:p>
+    <w:bookmarkEnd w:id="24"/>
+    <w:bookmarkStart w:id="25" w:name="how-results-were-judged"/>
     <w:p>
       <w:pPr>
         <w:pStyle w:val="Heading2"/>
@@ -1586,8 +1600,8 @@
         <w:t xml:space="preserve">A yield effect counts as negligible only if its 95 % interval lies within ±2 % per 10 points under every interval method. An insignificant coefficient alone is not evidence of no effect.</w:t>
       </w:r>
     </w:p>
-    <w:bookmarkEnd w:id="24"/>
-    <w:bookmarkStart w:id="25" w:name="index-and-spatial-analysis"/>
+    <w:bookmarkEnd w:id="25"/>
+    <w:bookmarkStart w:id="26" w:name="index-and-spatial-analysis"/>
     <w:p>
       <w:pPr>
         <w:pStyle w:val="Heading2"/>
@@ -1604,9 +1618,9 @@
         <w:t xml:space="preserve">The risk index combines exposure (flash and monsoon flood on Boro land, heat at flowering and cold at the reproductive stage) with sensitivity (production instability, worst fall in area, low yield). In line with the handbook on composite indicators (OECD and European Commission Joint Research Centre, 2008) and uncertainty analyses of such indices (Saisana et al., 2005; Tate, 2012), we rebuilt it under 6,018 combinations of three normalisations, two aggregations and four weighting schemes, including 1,000 random draws of weights. Global Moran’s I (Moran, 1950) and LISA (Anselin, 1995) were run under four neighbour definitions, with false discovery rate correction (Benjamini and Hochberg, 1995). Monsoon-flood and haor-interaction tests were corrected the same way as secondary tests.</w:t>
       </w:r>
     </w:p>
-    <w:bookmarkEnd w:id="25"/>
     <w:bookmarkEnd w:id="26"/>
-    <w:bookmarkStart w:id="57" w:name="results"/>
+    <w:bookmarkEnd w:id="27"/>
+    <w:bookmarkStart w:id="58" w:name="results"/>
     <w:p>
       <w:pPr>
         <w:pStyle w:val="Heading1"/>
@@ -1615,7 +1629,7 @@
         <w:t xml:space="preserve">5. Results</w:t>
       </w:r>
     </w:p>
-    <w:bookmarkStart w:id="33" w:name="Xb54e7ac6add942cacc1a96fc7e4806ce96cc125"/>
+    <w:bookmarkStart w:id="34" w:name="Xb54e7ac6add942cacc1a96fc7e4806ce96cc125"/>
     <w:p>
       <w:pPr>
         <w:pStyle w:val="Heading2"/>
@@ -1629,7 +1643,7 @@
         <w:pStyle w:val="FirstParagraph"/>
       </w:pPr>
       <w:r>
-        <w:t xml:space="preserve">Flash floods are concentrated in a few places and years (Fig. 1, Fig. 2). Sentinel-1 has 704 district-years but only about 11 effective observations (Table 3). Seven districts carry nearly all the variation, and two years carry most of it, so the flash-flood analysis is really a study of a few events. Monsoon floods are spread much more widely. Sentinel-1 also has a coverage break: scenes per haor district more than double after 2016 (Fig. 2b), which matters because 2016 is a key flood year.</w:t>
+        <w:t xml:space="preserve">Flash floods are concentrated in a few places and years (Fig. 1, Fig. 2). Sentinel-1 has 704 district-years but only about 11 effective observations (Table 3). Effective observations are the inverse of the sum of squared shares of the flood variation left after removing district and year means, so they fall as a few district-years dominate. Seven districts carry nearly all the variation, and two years carry most of it, so the flash-flood analysis is really a study of a few events. Monsoon floods are spread much more widely. Sentinel-1 also has a coverage break: scenes per haor district more than double after 2016 (Fig. 2b), which matters because 2016 is a key flood year.</w:t>
       </w:r>
     </w:p>
     <w:p>
@@ -1649,18 +1663,18 @@
           <wp:inline>
             <wp:extent cx="5220337" cy="3357896"/>
             <wp:effectExtent b="0" l="0" r="0" t="0"/>
-            <wp:docPr descr="" title="" id="28" name="Picture"/>
+            <wp:docPr descr="" title="" id="29" name="Picture"/>
             <a:graphic>
               <a:graphicData uri="http://schemas.openxmlformats.org/drawingml/2006/picture">
                 <pic:pic>
                   <pic:nvPicPr>
-                    <pic:cNvPr descr="figures/fig1_map.png" id="29" name="Picture"/>
+                    <pic:cNvPr descr="figures/fig1_map.png" id="30" name="Picture"/>
                     <pic:cNvPicPr>
                       <a:picLocks noChangeArrowheads="1" noChangeAspect="1"/>
                     </pic:cNvPicPr>
                   </pic:nvPicPr>
                   <pic:blipFill>
-                    <a:blip r:embed="rId27"/>
+                    <a:blip r:embed="rId28"/>
                     <a:stretch>
                       <a:fillRect/>
                     </a:stretch>
@@ -1704,18 +1718,18 @@
           <wp:inline>
             <wp:extent cx="5943600" cy="2299472"/>
             <wp:effectExtent b="0" l="0" r="0" t="0"/>
-            <wp:docPr descr="" title="" id="31" name="Picture"/>
+            <wp:docPr descr="" title="" id="32" name="Picture"/>
             <a:graphic>
               <a:graphicData uri="http://schemas.openxmlformats.org/drawingml/2006/picture">
                 <pic:pic>
                   <pic:nvPicPr>
-                    <pic:cNvPr descr="figures/fig2_design.png" id="32" name="Picture"/>
+                    <pic:cNvPr descr="figures/fig2_design.png" id="33" name="Picture"/>
                     <pic:cNvPicPr>
                       <a:picLocks noChangeArrowheads="1" noChangeAspect="1"/>
                     </pic:cNvPicPr>
                   </pic:nvPicPr>
                   <pic:blipFill>
-                    <a:blip r:embed="rId30"/>
+                    <a:blip r:embed="rId31"/>
                     <a:stretch>
                       <a:fillRect/>
                     </a:stretch>
@@ -1747,7 +1761,7 @@
         <w:pStyle w:val="BodyText"/>
       </w:pPr>
       <w:r>
-        <w:t xml:space="preserve">Table 3. Where the flood variation comes from.</w:t>
+        <w:t xml:space="preserve">Table 3. Where the flood variation comes from. Effective observations are defined in the text.</w:t>
       </w:r>
     </w:p>
     <w:tbl>
@@ -2053,8 +2067,8 @@
         </w:tc>
       </w:tr>
     </w:tbl>
-    <w:bookmarkEnd w:id="33"/>
-    <w:bookmarkStart w:id="34" w:name="main-flood-models"/>
+    <w:bookmarkEnd w:id="34"/>
+    <w:bookmarkStart w:id="35" w:name="main-flood-models"/>
     <w:p>
       <w:pPr>
         <w:pStyle w:val="Heading2"/>
@@ -2738,8 +2752,8 @@
         <w:t xml:space="preserve">The yield interval was narrow but just exceeded the ±2 % bound: −2.3 to 2.0 % for Sentinel-1 under Driscoll–Kraay errors, and up to 2.4 % for JRC under clustered errors. So the planned test for a negligible yield effect was not met. Yield effects were small, and no method gave a sizeable negative one.</w:t>
       </w:r>
     </w:p>
-    <w:bookmarkEnd w:id="34"/>
-    <w:bookmarkStart w:id="41" w:name="the-2017-flood"/>
+    <w:bookmarkEnd w:id="35"/>
+    <w:bookmarkStart w:id="42" w:name="the-2017-flood"/>
     <w:p>
       <w:pPr>
         <w:pStyle w:val="Heading2"/>
@@ -2773,18 +2787,18 @@
           <wp:inline>
             <wp:extent cx="5943600" cy="2299472"/>
             <wp:effectExtent b="0" l="0" r="0" t="0"/>
-            <wp:docPr descr="" title="" id="36" name="Picture"/>
+            <wp:docPr descr="" title="" id="37" name="Picture"/>
             <a:graphic>
               <a:graphicData uri="http://schemas.openxmlformats.org/drawingml/2006/picture">
                 <pic:pic>
                   <pic:nvPicPr>
-                    <pic:cNvPr descr="figures/fig3_by_year.png" id="37" name="Picture"/>
+                    <pic:cNvPr descr="figures/fig3_by_year.png" id="38" name="Picture"/>
                     <pic:cNvPicPr>
                       <a:picLocks noChangeArrowheads="1" noChangeAspect="1"/>
                     </pic:cNvPicPr>
                   </pic:nvPicPr>
                   <pic:blipFill>
-                    <a:blip r:embed="rId35"/>
+                    <a:blip r:embed="rId36"/>
                     <a:stretch>
                       <a:fillRect/>
                     </a:stretch>
@@ -3575,18 +3589,18 @@
           <wp:inline>
             <wp:extent cx="5943600" cy="2555857"/>
             <wp:effectExtent b="0" l="0" r="0" t="0"/>
-            <wp:docPr descr="" title="" id="39" name="Picture"/>
+            <wp:docPr descr="" title="" id="40" name="Picture"/>
             <a:graphic>
               <a:graphicData uri="http://schemas.openxmlformats.org/drawingml/2006/picture">
                 <pic:pic>
                   <pic:nvPicPr>
-                    <pic:cNvPr descr="figures/fig4_event_2017.png" id="40" name="Picture"/>
+                    <pic:cNvPr descr="figures/fig4_event_2017.png" id="41" name="Picture"/>
                     <pic:cNvPicPr>
                       <a:picLocks noChangeArrowheads="1" noChangeAspect="1"/>
                     </pic:cNvPicPr>
                   </pic:nvPicPr>
                   <pic:blipFill>
-                    <a:blip r:embed="rId38"/>
+                    <a:blip r:embed="rId39"/>
                     <a:stretch>
                       <a:fillRect/>
                     </a:stretch>
@@ -3618,6 +3632,14 @@
         <w:pStyle w:val="BodyText"/>
       </w:pPr>
       <w:r>
+        <w:t xml:space="preserve">Two non-haor districts stand out in Fig. 4a, with large changes in BBS area and almost no satellite loss. Patuakhali fell by 43 %, but from a base of under 2,000 ha. Chandpur rose by 67 %: its 2017 area is 110,467 ha, against 64,424 ha in 2015 and 67,733 ha in 2018. That value is as printed in the yearbook, and we found no flood or satellite explanation for it. Both cases show that BBS area can move for reasons other than flood, by as much as the flood signal.</w:t>
+      </w:r>
+    </w:p>
+    <w:p>
+      <w:pPr>
+        <w:pStyle w:val="BodyText"/>
+      </w:pPr>
+      <w:r>
         <w:t xml:space="preserve">Synthetic control gave the same pattern. The estimated 2017 area gaps were −70.4 % in Sunamganj, −29.3 % in Kishoreganj, −17.4 % in Sylhet, −13.2 % in Netrokona and −8.5 % in Habiganj, while yield gaps stayed within 3.9 % (Table 6). The planned test was not met: no gap ranked in the top 5 % relative to its pre-flood fit. With five years to match and many donors, the pre-flood fit is almost perfect, so this ratio is unstable. An exploratory test on the gap’s size alone ranks Sunamganj at p = 0.017 and Kishoreganj at p = 0.052, and the other three above 0.1.</w:t>
       </w:r>
     </w:p>
@@ -4396,8 +4418,8 @@
         </w:tc>
       </w:tr>
     </w:tbl>
-    <w:bookmarkEnd w:id="41"/>
-    <w:bookmarkStart w:id="42" w:name="evidence-independent-of-bbs"/>
+    <w:bookmarkEnd w:id="42"/>
+    <w:bookmarkStart w:id="43" w:name="evidence-independent-of-bbs"/>
     <w:p>
       <w:pPr>
         <w:pStyle w:val="Heading2"/>
@@ -4411,7 +4433,7 @@
         <w:pStyle w:val="FirstParagraph"/>
       </w:pPr>
       <w:r>
-        <w:t xml:space="preserve">The satellite measure uses no BBS data, and it passed its planned test. Each 10 points of flood raised satellite crop loss by 7.5 points with Sentinel-1 and 6.2 points with JRC, and satellite loss lowered BBS area (Driscoll–Kraay p = 0.041) but not yield (p = 0.226). In 2017, satellite loss reached 63 % of Boro land in Sunamganj and 59 % in Sylhet, and stayed below 4 % outside the haor (Fig. 1b, Fig. 4a).</w:t>
+        <w:t xml:space="preserve">The satellite measure uses no BBS data, and it passed its planned test. Each 10 points of flood raised satellite crop loss by 7.5 points with Sentinel-1 (Driscoll–Kraay p = 0.001) and 6.2 points with JRC (p = 0.005), and satellite loss lowered BBS area (p = 0.041) but not yield (p = 0.226). In 2017, satellite loss reached 63 % of Boro land in Sunamganj and 59 % in Sylhet, and at most 4.4 % outside the haor (Fig. 1b, Fig. 4a).</w:t>
       </w:r>
     </w:p>
     <w:p>
@@ -4422,8 +4444,8 @@
         <w:t xml:space="preserve">Published damage figures are also of the same order. Against the mean of 2015 and 2018, BBS shows a production loss of 1.08 million t in the seven haor districts in 2017, compared with 0.88 million t reported for the haor regions (Hossain et al., 2023). For Sunamganj, BBS implies 142,482 ha and 520,428 t lost, compared with 149,224 ha affected and 393,855 t damaged in a published estimate (Mondal et al., 2021).</w:t>
       </w:r>
     </w:p>
-    <w:bookmarkEnd w:id="42"/>
-    <w:bookmarkStart w:id="49" w:name="checks-and-verdict"/>
+    <w:bookmarkEnd w:id="43"/>
+    <w:bookmarkStart w:id="50" w:name="checks-and-verdict"/>
     <w:p>
       <w:pPr>
         <w:pStyle w:val="Heading2"/>
@@ -4437,7 +4459,7 @@
         <w:pStyle w:val="FirstParagraph"/>
       </w:pPr>
       <w:r>
-        <w:t xml:space="preserve">The required checks gave a mixed picture (Table 7, Fig. 5). All leave-out checks passed for Sentinel-1, and the flood-after-harvest placebo passed in both records. Next year’s flood, however, failed for Sentinel-1 (11.6 %, clustered p = 0.033), possibly because haor area was high in 2016, just before the 2017 flood. For JRC, the effect disappeared without 2017 (0.6 %) or Sunamganj (−1.5 %), and was not significant on rice land only. Most importantly, without both 2016 and 2017 no effect remained in either record (0.1 % and −0.1 %). Flood size also mattered: only the largest group, 20 % or more of a district, showed clear losses (−31.9 % with Sentinel-1, from 5 district-years, and −15.7 % with JRC, from 8; Fig. 6).</w:t>
+        <w:t xml:space="preserve">The required checks gave a mixed picture (Table 7, Fig. 5). Because the main Sentinel-1 sample starts in 2016, the planned check without 2015–2016 is the same model as leaving out 2016, so it is counted once. All leave-out checks passed for Sentinel-1, and the flood-after-harvest placebo passed in both records. Next year’s flood, however, failed for Sentinel-1 (11.6 %, clustered p = 0.033), possibly because haor area was high in 2016, just before the 2017 flood. For JRC, the effect disappeared without 2017 (0.6 %) or Sunamganj (−1.5 %), and was not significant on rice land only. Most importantly, without both 2016 and 2017 no effect remained in either record (0.1 % and −0.1 %). Flood size also mattered: only the largest group, 20 % or more of a district, showed clear losses (−31.9 % with Sentinel-1, from 5 district-years, and −15.7 % with JRC, from 8; Fig. 6). The size of the Sentinel-1 estimate also partly reflects small districts. Leaving out the six districts with a small Boro base gave −13.8 % with Sentinel-1 and −6.2 % with JRC, and a Poisson model, which weights by area, gave −10.9 % and −5.3 % (Table A.1). The two records are closer in both cases.</w:t>
       </w:r>
     </w:p>
     <w:p>
@@ -5970,74 +5992,6 @@
               <w:pStyle w:val="Compact"/>
             </w:pPr>
             <w:r>
-              <w:t xml:space="preserve">Sentinel-1 without 2015–2016</w:t>
-            </w:r>
-          </w:p>
-        </w:tc>
-        <w:tc>
-          <w:tcPr/>
-          <w:p>
-            <w:pPr>
-              <w:pStyle w:val="Compact"/>
-            </w:pPr>
-            <w:r>
-              <w:t xml:space="preserve">Sentinel-1</w:t>
-            </w:r>
-          </w:p>
-        </w:tc>
-        <w:tc>
-          <w:tcPr/>
-          <w:p>
-            <w:pPr>
-              <w:pStyle w:val="Compact"/>
-            </w:pPr>
-            <w:r>
-              <w:t xml:space="preserve">−16.7</w:t>
-            </w:r>
-          </w:p>
-        </w:tc>
-        <w:tc>
-          <w:tcPr/>
-          <w:p>
-            <w:pPr>
-              <w:pStyle w:val="Compact"/>
-            </w:pPr>
-            <w:r>
-              <w:t xml:space="preserve">0.005</w:t>
-            </w:r>
-          </w:p>
-        </w:tc>
-        <w:tc>
-          <w:tcPr/>
-          <w:p>
-            <w:pPr>
-              <w:pStyle w:val="Compact"/>
-            </w:pPr>
-            <w:r>
-              <w:t xml:space="preserve">&lt; 0.001</w:t>
-            </w:r>
-          </w:p>
-        </w:tc>
-        <w:tc>
-          <w:tcPr/>
-          <w:p>
-            <w:pPr>
-              <w:pStyle w:val="Compact"/>
-            </w:pPr>
-            <w:r>
-              <w:t xml:space="preserve">Pass</w:t>
-            </w:r>
-          </w:p>
-        </w:tc>
-      </w:tr>
-      <w:tr>
-        <w:tc>
-          <w:tcPr/>
-          <w:p>
-            <w:pPr>
-              <w:pStyle w:val="Compact"/>
-            </w:pPr>
-            <w:r>
               <w:t xml:space="preserve">Scene counts as controls</w:t>
             </w:r>
           </w:p>
@@ -6114,20 +6068,20 @@
       <w:r>
         <w:drawing>
           <wp:inline>
-            <wp:extent cx="5943600" cy="3485932"/>
+            <wp:extent cx="5943600" cy="3474633"/>
             <wp:effectExtent b="0" l="0" r="0" t="0"/>
-            <wp:docPr descr="" title="" id="44" name="Picture"/>
+            <wp:docPr descr="" title="" id="45" name="Picture"/>
             <a:graphic>
               <a:graphicData uri="http://schemas.openxmlformats.org/drawingml/2006/picture">
                 <pic:pic>
                   <pic:nvPicPr>
-                    <pic:cNvPr descr="figures/fig5_checks.png" id="45" name="Picture"/>
+                    <pic:cNvPr descr="figures/fig5_checks.png" id="46" name="Picture"/>
                     <pic:cNvPicPr>
                       <a:picLocks noChangeArrowheads="1" noChangeAspect="1"/>
                     </pic:cNvPicPr>
                   </pic:nvPicPr>
                   <pic:blipFill>
-                    <a:blip r:embed="rId43"/>
+                    <a:blip r:embed="rId44"/>
                     <a:stretch>
                       <a:fillRect/>
                     </a:stretch>
@@ -6135,7 +6089,7 @@
                   <pic:spPr bwMode="auto">
                     <a:xfrm>
                       <a:off x="0" y="0"/>
-                      <a:ext cx="5943600" cy="3485932"/>
+                      <a:ext cx="5943600" cy="3474633"/>
                     </a:xfrm>
                     <a:prstGeom prst="rect">
                       <a:avLst/>
@@ -6159,7 +6113,7 @@
         <w:pStyle w:val="BodyText"/>
       </w:pPr>
       <w:r>
-        <w:t xml:space="preserve">Fig. 6. Normal and extreme floods, against the group below 1 %. Bins with few district-years are uncertain.</w:t>
+        <w:t xml:space="preserve">Fig. 6. Normal and extreme floods, against the group below 1 %. Intervals are 95 %, clustered by district. Under each label, n gives the district-years in the bin, Sentinel-1 first.</w:t>
       </w:r>
     </w:p>
     <w:p>
@@ -6171,18 +6125,18 @@
           <wp:inline>
             <wp:extent cx="5943600" cy="2301660"/>
             <wp:effectExtent b="0" l="0" r="0" t="0"/>
-            <wp:docPr descr="" title="" id="47" name="Picture"/>
+            <wp:docPr descr="" title="" id="48" name="Picture"/>
             <a:graphic>
               <a:graphicData uri="http://schemas.openxmlformats.org/drawingml/2006/picture">
                 <pic:pic>
                   <pic:nvPicPr>
-                    <pic:cNvPr descr="figures/fig6_bins.png" id="48" name="Picture"/>
+                    <pic:cNvPr descr="figures/fig6_bins.png" id="49" name="Picture"/>
                     <pic:cNvPicPr>
                       <a:picLocks noChangeArrowheads="1" noChangeAspect="1"/>
                     </pic:cNvPicPr>
                   </pic:nvPicPr>
                   <pic:blipFill>
-                    <a:blip r:embed="rId46"/>
+                    <a:blip r:embed="rId47"/>
                     <a:stretch>
                       <a:fillRect/>
                     </a:stretch>
@@ -6214,7 +6168,7 @@
         <w:pStyle w:val="BodyText"/>
       </w:pPr>
       <w:r>
-        <w:t xml:space="preserve">Under the rule fixed in advance, the answer to the main question is</w:t>
+        <w:t xml:space="preserve">Under the plan’s rule, the answer to Q1 is</w:t>
       </w:r>
       <w:r>
         <w:t xml:space="preserve"> </w:t>
@@ -6227,11 +6181,11 @@
         <w:t xml:space="preserve">suggestive</w:t>
       </w:r>
       <w:r>
-        <w:t xml:space="preserve">, not supported. The significance rule held for Sentinel-1 but not for JRC, 19 of 23 required checks passed, and the planned synthetic-control test failed. Direction and design agreed throughout. For Q3, concentration in the haor could not be tested properly: outside it, Sentinel-1 flood reached 5 % in only 1.8 % of district-years, so any slope there is an extrapolation, and no haor interaction survived false discovery rate correction.</w:t>
-      </w:r>
-    </w:p>
-    <w:bookmarkEnd w:id="49"/>
-    <w:bookmarkStart w:id="50" w:name="flood-timing-exploratory"/>
+        <w:t xml:space="preserve">, not supported. The significance rule held for Sentinel-1 but not for JRC, 18 of 22 required checks passed, and the planned synthetic-control test failed. Direction and design agreed throughout. For Q3, concentration in the haor could not be tested properly: outside it, Sentinel-1 flood reached 5 % in only 1.8 % of district-years, so any slope there is an extrapolation, and no haor interaction survived false discovery rate correction.</w:t>
+      </w:r>
+    </w:p>
+    <w:bookmarkEnd w:id="50"/>
+    <w:bookmarkStart w:id="51" w:name="flood-timing-exploratory"/>
     <w:p>
       <w:pPr>
         <w:pStyle w:val="Heading2"/>
@@ -6774,14 +6728,14 @@
         <w:tblLook w:firstRow="1" w:lastRow="0" w:firstColumn="0" w:lastColumn="0" w:noHBand="0" w:noVBand="0" w:val="0020"/>
       </w:tblPr>
       <w:tblGrid>
-        <w:gridCol w:w="971"/>
-        <w:gridCol w:w="1270"/>
-        <w:gridCol w:w="1120"/>
-        <w:gridCol w:w="747"/>
-        <w:gridCol w:w="971"/>
-        <w:gridCol w:w="1344"/>
-        <w:gridCol w:w="747"/>
-        <w:gridCol w:w="747"/>
+        <w:gridCol w:w="990"/>
+        <w:gridCol w:w="1294"/>
+        <w:gridCol w:w="1142"/>
+        <w:gridCol w:w="761"/>
+        <w:gridCol w:w="990"/>
+        <w:gridCol w:w="1370"/>
+        <w:gridCol w:w="761"/>
+        <w:gridCol w:w="609"/>
       </w:tblGrid>
       <w:tr>
         <w:trPr>
@@ -6961,7 +6915,7 @@
               <w:pStyle w:val="Compact"/>
             </w:pPr>
             <w:r>
-              <w:t xml:space="preserve">0.092</w:t>
+              <w:t xml:space="preserve">0.079</w:t>
             </w:r>
           </w:p>
         </w:tc>
@@ -7051,7 +7005,7 @@
               <w:pStyle w:val="Compact"/>
             </w:pPr>
             <w:r>
-              <w:t xml:space="preserve">0.161</w:t>
+              <w:t xml:space="preserve">0.178</w:t>
             </w:r>
           </w:p>
         </w:tc>
@@ -7141,7 +7095,7 @@
               <w:pStyle w:val="Compact"/>
             </w:pPr>
             <w:r>
-              <w:t xml:space="preserve">0.059</w:t>
+              <w:t xml:space="preserve">0.061</w:t>
             </w:r>
           </w:p>
         </w:tc>
@@ -7231,7 +7185,7 @@
               <w:pStyle w:val="Compact"/>
             </w:pPr>
             <w:r>
-              <w:t xml:space="preserve">0.761</w:t>
+              <w:t xml:space="preserve">0.751</w:t>
             </w:r>
           </w:p>
         </w:tc>
@@ -7321,7 +7275,7 @@
               <w:pStyle w:val="Compact"/>
             </w:pPr>
             <w:r>
-              <w:t xml:space="preserve">0.010</w:t>
+              <w:t xml:space="preserve">0.009</w:t>
             </w:r>
           </w:p>
         </w:tc>
@@ -7411,7 +7365,7 @@
               <w:pStyle w:val="Compact"/>
             </w:pPr>
             <w:r>
-              <w:t xml:space="preserve">0.321</w:t>
+              <w:t xml:space="preserve">0.334</w:t>
             </w:r>
           </w:p>
         </w:tc>
@@ -7501,10 +7455,190 @@
               <w:pStyle w:val="Compact"/>
             </w:pPr>
             <w:r>
+              <w:t xml:space="preserve">0.001</w:t>
+            </w:r>
+          </w:p>
+        </w:tc>
+      </w:tr>
+      <w:tr>
+        <w:tc>
+          <w:tcPr/>
+          <w:p>
+            <w:pPr>
+              <w:pStyle w:val="Compact"/>
+            </w:pPr>
+            <w:r>
+              <w:t xml:space="preserve">JRC</w:t>
+            </w:r>
+          </w:p>
+        </w:tc>
+        <w:tc>
+          <w:tcPr/>
+          <w:p>
+            <w:pPr>
+              <w:pStyle w:val="Compact"/>
+            </w:pPr>
+            <w:r>
+              <w:t xml:space="preserve">Harvested area</w:t>
+            </w:r>
+          </w:p>
+        </w:tc>
+        <w:tc>
+          <w:tcPr/>
+          <w:p>
+            <w:pPr>
+              <w:pStyle w:val="Compact"/>
+            </w:pPr>
+            <w:r>
+              <w:t xml:space="preserve">Without 2017</w:t>
+            </w:r>
+          </w:p>
+        </w:tc>
+        <w:tc>
+          <w:tcPr/>
+          <w:p>
+            <w:pPr>
+              <w:pStyle w:val="Compact"/>
+            </w:pPr>
+            <w:r>
+              <w:t xml:space="preserve">−2.5</w:t>
+            </w:r>
+          </w:p>
+        </w:tc>
+        <w:tc>
+          <w:tcPr/>
+          <w:p>
+            <w:pPr>
+              <w:pStyle w:val="Compact"/>
+            </w:pPr>
+            <w:r>
+              <w:t xml:space="preserve">0.455</w:t>
+            </w:r>
+          </w:p>
+        </w:tc>
+        <w:tc>
+          <w:tcPr/>
+          <w:p>
+            <w:pPr>
+              <w:pStyle w:val="Compact"/>
+            </w:pPr>
+            <w:r>
+              <w:t xml:space="preserve">0.486</w:t>
+            </w:r>
+          </w:p>
+        </w:tc>
+        <w:tc>
+          <w:tcPr/>
+          <w:p>
+            <w:pPr>
+              <w:pStyle w:val="Compact"/>
+            </w:pPr>
+            <w:r>
+              <w:t xml:space="preserve">0.455</w:t>
+            </w:r>
+          </w:p>
+        </w:tc>
+        <w:tc>
+          <w:tcPr/>
+          <w:p>
+            <w:pPr>
+              <w:pStyle w:val="Compact"/>
+            </w:pPr>
+            <w:r>
+              <w:t xml:space="preserve">0.641</w:t>
+            </w:r>
+          </w:p>
+        </w:tc>
+      </w:tr>
+      <w:tr>
+        <w:tc>
+          <w:tcPr/>
+          <w:p>
+            <w:pPr>
+              <w:pStyle w:val="Compact"/>
+            </w:pPr>
+            <w:r>
+              <w:t xml:space="preserve">JRC</w:t>
+            </w:r>
+          </w:p>
+        </w:tc>
+        <w:tc>
+          <w:tcPr/>
+          <w:p>
+            <w:pPr>
+              <w:pStyle w:val="Compact"/>
+            </w:pPr>
+            <w:r>
+              <w:t xml:space="preserve">Harvested area</w:t>
+            </w:r>
+          </w:p>
+        </w:tc>
+        <w:tc>
+          <w:tcPr/>
+          <w:p>
+            <w:pPr>
+              <w:pStyle w:val="Compact"/>
+            </w:pPr>
+            <w:r>
+              <w:t xml:space="preserve">Without 2016</w:t>
+            </w:r>
+          </w:p>
+        </w:tc>
+        <w:tc>
+          <w:tcPr/>
+          <w:p>
+            <w:pPr>
+              <w:pStyle w:val="Compact"/>
+            </w:pPr>
+            <w:r>
+              <w:t xml:space="preserve">−24.3</w:t>
+            </w:r>
+          </w:p>
+        </w:tc>
+        <w:tc>
+          <w:tcPr/>
+          <w:p>
+            <w:pPr>
+              <w:pStyle w:val="Compact"/>
+            </w:pPr>
+            <w:r>
+              <w:t xml:space="preserve">0.054</w:t>
+            </w:r>
+          </w:p>
+        </w:tc>
+        <w:tc>
+          <w:tcPr/>
+          <w:p>
+            <w:pPr>
+              <w:pStyle w:val="Compact"/>
+            </w:pPr>
+            <w:r>
               <w:t xml:space="preserve">&lt; 0.001</w:t>
             </w:r>
           </w:p>
         </w:tc>
+        <w:tc>
+          <w:tcPr/>
+          <w:p>
+            <w:pPr>
+              <w:pStyle w:val="Compact"/>
+            </w:pPr>
+            <w:r>
+              <w:t xml:space="preserve">0.008</w:t>
+            </w:r>
+          </w:p>
+        </w:tc>
+        <w:tc>
+          <w:tcPr/>
+          <w:p>
+            <w:pPr>
+              <w:pStyle w:val="Compact"/>
+            </w:pPr>
+            <w:r>
+              <w:t xml:space="preserve">0.004</w:t>
+            </w:r>
+          </w:p>
+        </w:tc>
       </w:tr>
       <w:tr>
         <w:tc>
@@ -7525,7 +7659,97 @@
               <w:pStyle w:val="Compact"/>
             </w:pPr>
             <w:r>
-              <w:t xml:space="preserve">Harvested area</w:t>
+              <w:t xml:space="preserve">Yield</w:t>
+            </w:r>
+          </w:p>
+        </w:tc>
+        <w:tc>
+          <w:tcPr/>
+          <w:p>
+            <w:pPr>
+              <w:pStyle w:val="Compact"/>
+            </w:pPr>
+            <w:r>
+              <w:t xml:space="preserve">All years</w:t>
+            </w:r>
+          </w:p>
+        </w:tc>
+        <w:tc>
+          <w:tcPr/>
+          <w:p>
+            <w:pPr>
+              <w:pStyle w:val="Compact"/>
+            </w:pPr>
+            <w:r>
+              <w:t xml:space="preserve">0.3</w:t>
+            </w:r>
+          </w:p>
+        </w:tc>
+        <w:tc>
+          <w:tcPr/>
+          <w:p>
+            <w:pPr>
+              <w:pStyle w:val="Compact"/>
+            </w:pPr>
+            <w:r>
+              <w:t xml:space="preserve">0.791</w:t>
+            </w:r>
+          </w:p>
+        </w:tc>
+        <w:tc>
+          <w:tcPr/>
+          <w:p>
+            <w:pPr>
+              <w:pStyle w:val="Compact"/>
+            </w:pPr>
+            <w:r>
+              <w:t xml:space="preserve">0.737</w:t>
+            </w:r>
+          </w:p>
+        </w:tc>
+        <w:tc>
+          <w:tcPr/>
+          <w:p>
+            <w:pPr>
+              <w:pStyle w:val="Compact"/>
+            </w:pPr>
+            <w:r>
+              <w:t xml:space="preserve">0.763</w:t>
+            </w:r>
+          </w:p>
+        </w:tc>
+        <w:tc>
+          <w:tcPr/>
+          <w:p>
+            <w:pPr>
+              <w:pStyle w:val="Compact"/>
+            </w:pPr>
+            <w:r>
+              <w:t xml:space="preserve">0.795</w:t>
+            </w:r>
+          </w:p>
+        </w:tc>
+      </w:tr>
+      <w:tr>
+        <w:tc>
+          <w:tcPr/>
+          <w:p>
+            <w:pPr>
+              <w:pStyle w:val="Compact"/>
+            </w:pPr>
+            <w:r>
+              <w:t xml:space="preserve">JRC</w:t>
+            </w:r>
+          </w:p>
+        </w:tc>
+        <w:tc>
+          <w:tcPr/>
+          <w:p>
+            <w:pPr>
+              <w:pStyle w:val="Compact"/>
+            </w:pPr>
+            <w:r>
+              <w:t xml:space="preserve">Yield</w:t>
             </w:r>
           </w:p>
         </w:tc>
@@ -7547,51 +7771,51 @@
               <w:pStyle w:val="Compact"/>
             </w:pPr>
             <w:r>
-              <w:t xml:space="preserve">−2.5</w:t>
-            </w:r>
-          </w:p>
-        </w:tc>
-        <w:tc>
-          <w:tcPr/>
-          <w:p>
-            <w:pPr>
-              <w:pStyle w:val="Compact"/>
-            </w:pPr>
-            <w:r>
-              <w:t xml:space="preserve">0.455</w:t>
-            </w:r>
-          </w:p>
-        </w:tc>
-        <w:tc>
-          <w:tcPr/>
-          <w:p>
-            <w:pPr>
-              <w:pStyle w:val="Compact"/>
-            </w:pPr>
-            <w:r>
-              <w:t xml:space="preserve">0.486</w:t>
-            </w:r>
-          </w:p>
-        </w:tc>
-        <w:tc>
-          <w:tcPr/>
-          <w:p>
-            <w:pPr>
-              <w:pStyle w:val="Compact"/>
-            </w:pPr>
-            <w:r>
-              <w:t xml:space="preserve">0.455</w:t>
-            </w:r>
-          </w:p>
-        </w:tc>
-        <w:tc>
-          <w:tcPr/>
-          <w:p>
-            <w:pPr>
-              <w:pStyle w:val="Compact"/>
-            </w:pPr>
-            <w:r>
-              <w:t xml:space="preserve">0.651</w:t>
+              <w:t xml:space="preserve">1.4</w:t>
+            </w:r>
+          </w:p>
+        </w:tc>
+        <w:tc>
+          <w:tcPr/>
+          <w:p>
+            <w:pPr>
+              <w:pStyle w:val="Compact"/>
+            </w:pPr>
+            <w:r>
+              <w:t xml:space="preserve">0.364</w:t>
+            </w:r>
+          </w:p>
+        </w:tc>
+        <w:tc>
+          <w:tcPr/>
+          <w:p>
+            <w:pPr>
+              <w:pStyle w:val="Compact"/>
+            </w:pPr>
+            <w:r>
+              <w:t xml:space="preserve">0.448</w:t>
+            </w:r>
+          </w:p>
+        </w:tc>
+        <w:tc>
+          <w:tcPr/>
+          <w:p>
+            <w:pPr>
+              <w:pStyle w:val="Compact"/>
+            </w:pPr>
+            <w:r>
+              <w:t xml:space="preserve">0.384</w:t>
+            </w:r>
+          </w:p>
+        </w:tc>
+        <w:tc>
+          <w:tcPr/>
+          <w:p>
+            <w:pPr>
+              <w:pStyle w:val="Compact"/>
+            </w:pPr>
+            <w:r>
+              <w:t xml:space="preserve">0.411</w:t>
             </w:r>
           </w:p>
         </w:tc>
@@ -7615,7 +7839,7 @@
               <w:pStyle w:val="Compact"/>
             </w:pPr>
             <w:r>
-              <w:t xml:space="preserve">Harvested area</w:t>
+              <w:t xml:space="preserve">Yield</w:t>
             </w:r>
           </w:p>
         </w:tc>
@@ -7637,276 +7861,6 @@
               <w:pStyle w:val="Compact"/>
             </w:pPr>
             <w:r>
-              <w:t xml:space="preserve">−24.3</w:t>
-            </w:r>
-          </w:p>
-        </w:tc>
-        <w:tc>
-          <w:tcPr/>
-          <w:p>
-            <w:pPr>
-              <w:pStyle w:val="Compact"/>
-            </w:pPr>
-            <w:r>
-              <w:t xml:space="preserve">0.054</w:t>
-            </w:r>
-          </w:p>
-        </w:tc>
-        <w:tc>
-          <w:tcPr/>
-          <w:p>
-            <w:pPr>
-              <w:pStyle w:val="Compact"/>
-            </w:pPr>
-            <w:r>
-              <w:t xml:space="preserve">&lt; 0.001</w:t>
-            </w:r>
-          </w:p>
-        </w:tc>
-        <w:tc>
-          <w:tcPr/>
-          <w:p>
-            <w:pPr>
-              <w:pStyle w:val="Compact"/>
-            </w:pPr>
-            <w:r>
-              <w:t xml:space="preserve">0.008</w:t>
-            </w:r>
-          </w:p>
-        </w:tc>
-        <w:tc>
-          <w:tcPr/>
-          <w:p>
-            <w:pPr>
-              <w:pStyle w:val="Compact"/>
-            </w:pPr>
-            <w:r>
-              <w:t xml:space="preserve">0.001</w:t>
-            </w:r>
-          </w:p>
-        </w:tc>
-      </w:tr>
-      <w:tr>
-        <w:tc>
-          <w:tcPr/>
-          <w:p>
-            <w:pPr>
-              <w:pStyle w:val="Compact"/>
-            </w:pPr>
-            <w:r>
-              <w:t xml:space="preserve">JRC</w:t>
-            </w:r>
-          </w:p>
-        </w:tc>
-        <w:tc>
-          <w:tcPr/>
-          <w:p>
-            <w:pPr>
-              <w:pStyle w:val="Compact"/>
-            </w:pPr>
-            <w:r>
-              <w:t xml:space="preserve">Yield</w:t>
-            </w:r>
-          </w:p>
-        </w:tc>
-        <w:tc>
-          <w:tcPr/>
-          <w:p>
-            <w:pPr>
-              <w:pStyle w:val="Compact"/>
-            </w:pPr>
-            <w:r>
-              <w:t xml:space="preserve">All years</w:t>
-            </w:r>
-          </w:p>
-        </w:tc>
-        <w:tc>
-          <w:tcPr/>
-          <w:p>
-            <w:pPr>
-              <w:pStyle w:val="Compact"/>
-            </w:pPr>
-            <w:r>
-              <w:t xml:space="preserve">0.3</w:t>
-            </w:r>
-          </w:p>
-        </w:tc>
-        <w:tc>
-          <w:tcPr/>
-          <w:p>
-            <w:pPr>
-              <w:pStyle w:val="Compact"/>
-            </w:pPr>
-            <w:r>
-              <w:t xml:space="preserve">0.791</w:t>
-            </w:r>
-          </w:p>
-        </w:tc>
-        <w:tc>
-          <w:tcPr/>
-          <w:p>
-            <w:pPr>
-              <w:pStyle w:val="Compact"/>
-            </w:pPr>
-            <w:r>
-              <w:t xml:space="preserve">0.737</w:t>
-            </w:r>
-          </w:p>
-        </w:tc>
-        <w:tc>
-          <w:tcPr/>
-          <w:p>
-            <w:pPr>
-              <w:pStyle w:val="Compact"/>
-            </w:pPr>
-            <w:r>
-              <w:t xml:space="preserve">0.763</w:t>
-            </w:r>
-          </w:p>
-        </w:tc>
-        <w:tc>
-          <w:tcPr/>
-          <w:p>
-            <w:pPr>
-              <w:pStyle w:val="Compact"/>
-            </w:pPr>
-            <w:r>
-              <w:t xml:space="preserve">0.789</w:t>
-            </w:r>
-          </w:p>
-        </w:tc>
-      </w:tr>
-      <w:tr>
-        <w:tc>
-          <w:tcPr/>
-          <w:p>
-            <w:pPr>
-              <w:pStyle w:val="Compact"/>
-            </w:pPr>
-            <w:r>
-              <w:t xml:space="preserve">JRC</w:t>
-            </w:r>
-          </w:p>
-        </w:tc>
-        <w:tc>
-          <w:tcPr/>
-          <w:p>
-            <w:pPr>
-              <w:pStyle w:val="Compact"/>
-            </w:pPr>
-            <w:r>
-              <w:t xml:space="preserve">Yield</w:t>
-            </w:r>
-          </w:p>
-        </w:tc>
-        <w:tc>
-          <w:tcPr/>
-          <w:p>
-            <w:pPr>
-              <w:pStyle w:val="Compact"/>
-            </w:pPr>
-            <w:r>
-              <w:t xml:space="preserve">Without 2017</w:t>
-            </w:r>
-          </w:p>
-        </w:tc>
-        <w:tc>
-          <w:tcPr/>
-          <w:p>
-            <w:pPr>
-              <w:pStyle w:val="Compact"/>
-            </w:pPr>
-            <w:r>
-              <w:t xml:space="preserve">1.4</w:t>
-            </w:r>
-          </w:p>
-        </w:tc>
-        <w:tc>
-          <w:tcPr/>
-          <w:p>
-            <w:pPr>
-              <w:pStyle w:val="Compact"/>
-            </w:pPr>
-            <w:r>
-              <w:t xml:space="preserve">0.364</w:t>
-            </w:r>
-          </w:p>
-        </w:tc>
-        <w:tc>
-          <w:tcPr/>
-          <w:p>
-            <w:pPr>
-              <w:pStyle w:val="Compact"/>
-            </w:pPr>
-            <w:r>
-              <w:t xml:space="preserve">0.448</w:t>
-            </w:r>
-          </w:p>
-        </w:tc>
-        <w:tc>
-          <w:tcPr/>
-          <w:p>
-            <w:pPr>
-              <w:pStyle w:val="Compact"/>
-            </w:pPr>
-            <w:r>
-              <w:t xml:space="preserve">0.384</w:t>
-            </w:r>
-          </w:p>
-        </w:tc>
-        <w:tc>
-          <w:tcPr/>
-          <w:p>
-            <w:pPr>
-              <w:pStyle w:val="Compact"/>
-            </w:pPr>
-            <w:r>
-              <w:t xml:space="preserve">0.411</w:t>
-            </w:r>
-          </w:p>
-        </w:tc>
-      </w:tr>
-      <w:tr>
-        <w:tc>
-          <w:tcPr/>
-          <w:p>
-            <w:pPr>
-              <w:pStyle w:val="Compact"/>
-            </w:pPr>
-            <w:r>
-              <w:t xml:space="preserve">JRC</w:t>
-            </w:r>
-          </w:p>
-        </w:tc>
-        <w:tc>
-          <w:tcPr/>
-          <w:p>
-            <w:pPr>
-              <w:pStyle w:val="Compact"/>
-            </w:pPr>
-            <w:r>
-              <w:t xml:space="preserve">Yield</w:t>
-            </w:r>
-          </w:p>
-        </w:tc>
-        <w:tc>
-          <w:tcPr/>
-          <w:p>
-            <w:pPr>
-              <w:pStyle w:val="Compact"/>
-            </w:pPr>
-            <w:r>
-              <w:t xml:space="preserve">Without 2016</w:t>
-            </w:r>
-          </w:p>
-        </w:tc>
-        <w:tc>
-          <w:tcPr/>
-          <w:p>
-            <w:pPr>
-              <w:pStyle w:val="Compact"/>
-            </w:pPr>
-            <w:r>
               <w:t xml:space="preserve">0.0</w:t>
             </w:r>
           </w:p>
@@ -7951,20 +7905,20 @@
               <w:pStyle w:val="Compact"/>
             </w:pPr>
             <w:r>
-              <w:t xml:space="preserve">0.980</w:t>
+              <w:t xml:space="preserve">0.982</w:t>
             </w:r>
           </w:p>
         </w:tc>
       </w:tr>
     </w:tbl>
-    <w:bookmarkEnd w:id="50"/>
-    <w:bookmarkStart w:id="51" w:name="monsoon-floods"/>
+    <w:bookmarkEnd w:id="51"/>
+    <w:bookmarkStart w:id="52" w:name="monsoon-floods-q2"/>
     <w:p>
       <w:pPr>
         <w:pStyle w:val="Heading2"/>
       </w:pPr>
       <w:r>
-        <w:t xml:space="preserve">5.7 Monsoon floods</w:t>
+        <w:t xml:space="preserve">5.7 Monsoon floods (Q2)</w:t>
       </w:r>
     </w:p>
     <w:p>
@@ -8556,14 +8510,14 @@
         </w:tc>
       </w:tr>
     </w:tbl>
-    <w:bookmarkEnd w:id="51"/>
-    <w:bookmarkStart w:id="52" w:name="ndvi"/>
+    <w:bookmarkEnd w:id="52"/>
+    <w:bookmarkStart w:id="53" w:name="ndvi-q4"/>
     <w:p>
       <w:pPr>
         <w:pStyle w:val="Heading2"/>
       </w:pPr>
       <w:r>
-        <w:t xml:space="preserve">5.8 NDVI</w:t>
+        <w:t xml:space="preserve">5.8 NDVI (Q4)</w:t>
       </w:r>
     </w:p>
     <w:p>
@@ -8571,7 +8525,7 @@
         <w:pStyle w:val="FirstParagraph"/>
       </w:pPr>
       <w:r>
-        <w:t xml:space="preserve">NDVI tracked differences between districts and the shared rise in yield, but not year-to-year departures within a district (Table 11). Over January–April, the correlation with yield was 0.46 between districts and 0.42 within districts, and fell to −0.07 once year effects were removed. No window gave a significant effect, including peak greenness (Mosleh et al., 2016), and the result did not depend on how much of a district is rice land (0.05 and 0.06). NDVI-based yield estimates at national or division level (Mosleh et al., 2016; Alam et al., 2019) may therefore capture broad differences and trends, not shocks to a district.</w:t>
+        <w:t xml:space="preserve">NDVI tracked differences between districts and the shared rise in yield, but not year-to-year departures within a district (Table 11). Over January–April, the correlation with yield was 0.46 between districts and 0.42 within districts, and fell to −0.07 once year effects were removed. No window gave a significant effect, including peak greenness (Mosleh et al., 2016), and the result did not depend on how much of a district is rice land (a correlation of 0.05 in districts with more rice land and 0.06 in those with less). NDVI-based yield estimates at national or division level (Mosleh et al., 2016; Alam et al., 2019) may therefore capture broad differences and trends, not shocks to a district.</w:t>
       </w:r>
     </w:p>
     <w:p>
@@ -8688,7 +8642,7 @@
               <w:pStyle w:val="Compact"/>
             </w:pPr>
             <w:r>
-              <w:t xml:space="preserve">January-April</w:t>
+              <w:t xml:space="preserve">January–April</w:t>
             </w:r>
           </w:p>
         </w:tc>
@@ -8754,7 +8708,7 @@
               <w:pStyle w:val="Compact"/>
             </w:pPr>
             <w:r>
-              <w:t xml:space="preserve">0.214</w:t>
+              <w:t xml:space="preserve">0.211</w:t>
             </w:r>
           </w:p>
         </w:tc>
@@ -8833,7 +8787,7 @@
               <w:pStyle w:val="Compact"/>
             </w:pPr>
             <w:r>
-              <w:t xml:space="preserve">0.181</w:t>
+              <w:t xml:space="preserve">0.202</w:t>
             </w:r>
           </w:p>
         </w:tc>
@@ -8918,14 +8872,14 @@
         </w:tc>
       </w:tr>
     </w:tbl>
-    <w:bookmarkEnd w:id="52"/>
-    <w:bookmarkStart w:id="56" w:name="risk-index-and-spatial-patterns"/>
+    <w:bookmarkEnd w:id="53"/>
+    <w:bookmarkStart w:id="57" w:name="risk-index-and-spatial-patterns-q5"/>
     <w:p>
       <w:pPr>
         <w:pStyle w:val="Heading2"/>
       </w:pPr>
       <w:r>
-        <w:t xml:space="preserve">5.9 Risk index and spatial patterns</w:t>
+        <w:t xml:space="preserve">5.9 Risk index and spatial patterns (Q5)</w:t>
       </w:r>
     </w:p>
     <w:p>
@@ -8933,7 +8887,15 @@
         <w:pStyle w:val="FirstParagraph"/>
       </w:pPr>
       <w:r>
-        <w:t xml:space="preserve">The haor dominates the index: 6 of the top ten districts are in the haor, led by Sunamganj (Table 12, Fig. 7). The ranking is not stable, however. Across 6,018 combinations, the median correlation with the base ranking was 0.66, the median district stayed in its risk tier in 35 % of cases, and no district was in the top ten in at least 90 % of them. Two results need care. Patuakhali and Barguna rank high because Boro expanded there from a very small base, which appears as instability but is not loss. Hill districts such as Rangamati have so little rice land that their flood shares are unreliable.</w:t>
+        <w:t xml:space="preserve">The haor dominates the index: 6 of the top ten districts are in the haor, led by Sunamganj (Table 12, Fig. 7). Six districts with a mean Boro area below 15,000 ha are flagged, a threshold set after the first results: Patuakhali, Barguna, Rangamati, Bandarban, Khagrachhari and Jhalokati. Their high ranks are not reliable. Hill districts such as Rangamati have so little rice land that their flood shares rest on few pixels, and Patuakhali and Barguna rank high because Boro expanded there from a very small base, which appears as instability but is not loss. Without these six, all 7 haor districts are in the top ten.</w:t>
+      </w:r>
+    </w:p>
+    <w:p>
+      <w:pPr>
+        <w:pStyle w:val="BodyText"/>
+      </w:pPr>
+      <w:r>
+        <w:t xml:space="preserve">The ranking is not stable, however. Across 6,018 combinations, the median correlation with the base ranking was 0.66, the median district stayed in its risk tier in 35 % of cases, and no district was in the top ten in at least 90 % of them.</w:t>
       </w:r>
     </w:p>
     <w:p>
@@ -8952,12 +8914,13 @@
         <w:tblLook w:firstRow="1" w:lastRow="0" w:firstColumn="0" w:lastColumn="0" w:noHBand="0" w:noVBand="0" w:val="0020"/>
       </w:tblPr>
       <w:tblGrid>
-        <w:gridCol w:w="1073"/>
-        <w:gridCol w:w="1879"/>
-        <w:gridCol w:w="1073"/>
-        <w:gridCol w:w="1879"/>
-        <w:gridCol w:w="939"/>
-        <w:gridCol w:w="1073"/>
+        <w:gridCol w:w="931"/>
+        <w:gridCol w:w="1630"/>
+        <w:gridCol w:w="931"/>
+        <w:gridCol w:w="1048"/>
+        <w:gridCol w:w="1630"/>
+        <w:gridCol w:w="815"/>
+        <w:gridCol w:w="931"/>
       </w:tblGrid>
       <w:tr>
         <w:trPr>
@@ -9003,6 +8966,17 @@
               <w:pStyle w:val="Compact"/>
             </w:pPr>
             <w:r>
+              <w:t xml:space="preserve">Small Boro base</w:t>
+            </w:r>
+          </w:p>
+        </w:tc>
+        <w:tc>
+          <w:tcPr/>
+          <w:p>
+            <w:pPr>
+              <w:pStyle w:val="Compact"/>
+            </w:pPr>
+            <w:r>
               <w:t xml:space="preserve">Rank range, 5th–95th percentile</w:t>
             </w:r>
           </w:p>
@@ -9071,6 +9045,17 @@
               <w:pStyle w:val="Compact"/>
             </w:pPr>
             <w:r>
+              <w:t xml:space="preserve">No</w:t>
+            </w:r>
+          </w:p>
+        </w:tc>
+        <w:tc>
+          <w:tcPr/>
+          <w:p>
+            <w:pPr>
+              <w:pStyle w:val="Compact"/>
+            </w:pPr>
+            <w:r>
               <w:t xml:space="preserve">1–36</w:t>
             </w:r>
           </w:p>
@@ -9139,6 +9124,17 @@
               <w:pStyle w:val="Compact"/>
             </w:pPr>
             <w:r>
+              <w:t xml:space="preserve">No</w:t>
+            </w:r>
+          </w:p>
+        </w:tc>
+        <w:tc>
+          <w:tcPr/>
+          <w:p>
+            <w:pPr>
+              <w:pStyle w:val="Compact"/>
+            </w:pPr>
+            <w:r>
               <w:t xml:space="preserve">2–58</w:t>
             </w:r>
           </w:p>
@@ -9207,6 +9203,17 @@
               <w:pStyle w:val="Compact"/>
             </w:pPr>
             <w:r>
+              <w:t xml:space="preserve">Yes</w:t>
+            </w:r>
+          </w:p>
+        </w:tc>
+        <w:tc>
+          <w:tcPr/>
+          <w:p>
+            <w:pPr>
+              <w:pStyle w:val="Compact"/>
+            </w:pPr>
+            <w:r>
               <w:t xml:space="preserve">1–52</w:t>
             </w:r>
           </w:p>
@@ -9275,6 +9282,17 @@
               <w:pStyle w:val="Compact"/>
             </w:pPr>
             <w:r>
+              <w:t xml:space="preserve">Yes</w:t>
+            </w:r>
+          </w:p>
+        </w:tc>
+        <w:tc>
+          <w:tcPr/>
+          <w:p>
+            <w:pPr>
+              <w:pStyle w:val="Compact"/>
+            </w:pPr>
+            <w:r>
               <w:t xml:space="preserve">2–53</w:t>
             </w:r>
           </w:p>
@@ -9343,6 +9361,17 @@
               <w:pStyle w:val="Compact"/>
             </w:pPr>
             <w:r>
+              <w:t xml:space="preserve">No</w:t>
+            </w:r>
+          </w:p>
+        </w:tc>
+        <w:tc>
+          <w:tcPr/>
+          <w:p>
+            <w:pPr>
+              <w:pStyle w:val="Compact"/>
+            </w:pPr>
+            <w:r>
               <w:t xml:space="preserve">2–30</w:t>
             </w:r>
           </w:p>
@@ -9411,6 +9440,17 @@
               <w:pStyle w:val="Compact"/>
             </w:pPr>
             <w:r>
+              <w:t xml:space="preserve">No</w:t>
+            </w:r>
+          </w:p>
+        </w:tc>
+        <w:tc>
+          <w:tcPr/>
+          <w:p>
+            <w:pPr>
+              <w:pStyle w:val="Compact"/>
+            </w:pPr>
+            <w:r>
               <w:t xml:space="preserve">2–24</w:t>
             </w:r>
           </w:p>
@@ -9479,6 +9519,17 @@
               <w:pStyle w:val="Compact"/>
             </w:pPr>
             <w:r>
+              <w:t xml:space="preserve">Yes</w:t>
+            </w:r>
+          </w:p>
+        </w:tc>
+        <w:tc>
+          <w:tcPr/>
+          <w:p>
+            <w:pPr>
+              <w:pStyle w:val="Compact"/>
+            </w:pPr>
+            <w:r>
               <w:t xml:space="preserve">1–14</w:t>
             </w:r>
           </w:p>
@@ -9547,6 +9598,17 @@
               <w:pStyle w:val="Compact"/>
             </w:pPr>
             <w:r>
+              <w:t xml:space="preserve">No</w:t>
+            </w:r>
+          </w:p>
+        </w:tc>
+        <w:tc>
+          <w:tcPr/>
+          <w:p>
+            <w:pPr>
+              <w:pStyle w:val="Compact"/>
+            </w:pPr>
+            <w:r>
               <w:t xml:space="preserve">4–34</w:t>
             </w:r>
           </w:p>
@@ -9615,6 +9677,17 @@
               <w:pStyle w:val="Compact"/>
             </w:pPr>
             <w:r>
+              <w:t xml:space="preserve">No</w:t>
+            </w:r>
+          </w:p>
+        </w:tc>
+        <w:tc>
+          <w:tcPr/>
+          <w:p>
+            <w:pPr>
+              <w:pStyle w:val="Compact"/>
+            </w:pPr>
+            <w:r>
               <w:t xml:space="preserve">2–51</w:t>
             </w:r>
           </w:p>
@@ -9683,6 +9756,17 @@
               <w:pStyle w:val="Compact"/>
             </w:pPr>
             <w:r>
+              <w:t xml:space="preserve">No</w:t>
+            </w:r>
+          </w:p>
+        </w:tc>
+        <w:tc>
+          <w:tcPr/>
+          <w:p>
+            <w:pPr>
+              <w:pStyle w:val="Compact"/>
+            </w:pPr>
+            <w:r>
               <w:t xml:space="preserve">5–46</w:t>
             </w:r>
           </w:p>
@@ -9716,7 +9800,7 @@
         <w:pStyle w:val="BodyText"/>
       </w:pPr>
       <w:r>
-        <w:t xml:space="preserve">Fig. 7. Risk tier and rank under all combinations. Bars show the 5th to 95th percentile of rank, and dots the base ranking.</w:t>
+        <w:t xml:space="preserve">Fig. 7. Risk tier and rank under all combinations. Hatched districts, starred in panel (b), have a small Boro base, so their high ranks are not reliable. Bars show the 5th to 95th percentile of rank, and dots the base ranking.</w:t>
       </w:r>
     </w:p>
     <w:p>
@@ -9728,18 +9812,18 @@
           <wp:inline>
             <wp:extent cx="5943600" cy="3502738"/>
             <wp:effectExtent b="0" l="0" r="0" t="0"/>
-            <wp:docPr descr="" title="" id="54" name="Picture"/>
+            <wp:docPr descr="" title="" id="55" name="Picture"/>
             <a:graphic>
               <a:graphicData uri="http://schemas.openxmlformats.org/drawingml/2006/picture">
                 <pic:pic>
                   <pic:nvPicPr>
-                    <pic:cNvPr descr="figures/fig7_index.png" id="55" name="Picture"/>
+                    <pic:cNvPr descr="figures/fig7_index.png" id="56" name="Picture"/>
                     <pic:cNvPicPr>
                       <a:picLocks noChangeArrowheads="1" noChangeAspect="1"/>
                     </pic:cNvPicPr>
                   </pic:nvPicPr>
                   <pic:blipFill>
-                    <a:blip r:embed="rId53"/>
+                    <a:blip r:embed="rId54"/>
                     <a:stretch>
                       <a:fillRect/>
                     </a:stretch>
@@ -10093,9 +10177,9 @@
         <w:t xml:space="preserve">A yield-only view gives a different picture. Sunamganj ranks 25th of 64 on yield instability but 3rd on production instability, and the two rankings correlate at only 0.61.</w:t>
       </w:r>
     </w:p>
-    <w:bookmarkEnd w:id="56"/>
     <w:bookmarkEnd w:id="57"/>
-    <w:bookmarkStart w:id="62" w:name="discussion"/>
+    <w:bookmarkEnd w:id="58"/>
+    <w:bookmarkStart w:id="63" w:name="discussion"/>
     <w:p>
       <w:pPr>
         <w:pStyle w:val="Heading1"/>
@@ -10104,7 +10188,7 @@
         <w:t xml:space="preserve">6. Discussion</w:t>
       </w:r>
     </w:p>
-    <w:bookmarkStart w:id="58" w:name="what-can-and-cannot-be-claimed"/>
+    <w:bookmarkStart w:id="59" w:name="what-can-and-cannot-be-claimed"/>
     <w:p>
       <w:pPr>
         <w:pStyle w:val="Heading2"/>
@@ -10118,7 +10202,7 @@
         <w:pStyle w:val="FirstParagraph"/>
       </w:pPr>
       <w:r>
-        <w:t xml:space="preserve">One claim is well supported as a description of a single event. In the 2017 flood, the loss in BBS statistics appeared in harvested area and production, and almost none in yield. Three designs agree on this, in both flood records. A satellite measure that uses no BBS data places the loss in the same districts, and published damage figures are of the same order.</w:t>
+        <w:t xml:space="preserve">One claim is well supported as a description of a single event. In the 2017 flood, the loss in BBS statistics appeared in harvested area and production, and almost none in yield. The three designs agree in direction, in both flood records, although the planned synthetic-control test failed and the JRC estimate depends on 2017. A satellite measure that uses no BBS data places the loss in the same districts, and published damage figures are of the same order.</w:t>
       </w:r>
     </w:p>
     <w:p>
@@ -10126,11 +10210,11 @@
         <w:pStyle w:val="BodyText"/>
       </w:pPr>
       <w:r>
-        <w:t xml:space="preserve">The broader claim, that flash floods generally reduce Boro through area, is not established. Under a rule fixed in advance it is only suggestive. The estimate rests on 2016 and 2017, the 2016 and 2022 floods left no fall in area, and the two flood records differ about five-fold in their main estimates. We report that plainly because a single significant estimate of about 22 % per 10 points would have told a stronger and less accurate story. This also bears on how flood effects are read elsewhere: with few events and a few treated districts, an estimate from a large panel can be one event in disguise.</w:t>
-      </w:r>
-    </w:p>
-    <w:bookmarkEnd w:id="58"/>
-    <w:bookmarkStart w:id="59" w:name="why-area-and-not-yield"/>
+        <w:t xml:space="preserve">The broader claim, that flash floods generally reduce Boro through area, is not established. Under the plan’s rule it is only suggestive. The estimate rests on 2016 and 2017, the 2016 and 2022 floods left no fall in area, and the two flood records differ about five-fold in their main estimates, and about two-fold once small districts are set aside. We report that plainly because a single significant estimate of about 22 % per 10 points would have told a stronger and less accurate story. This also bears on how flood effects are read elsewhere: with few events and a few treated districts, an estimate from a large panel can be one event in disguise.</w:t>
+      </w:r>
+    </w:p>
+    <w:bookmarkEnd w:id="59"/>
+    <w:bookmarkStart w:id="60" w:name="why-area-and-not-yield"/>
     <w:p>
       <w:pPr>
         <w:pStyle w:val="Heading2"/>
@@ -10155,8 +10239,8 @@
         <w:t xml:space="preserve">This does not contradict Li et al. (2025), who report yield losses from submergence worldwide. Li et al. and this study measure different things in different statistical systems. Whether crop that is totally lost appears in yield or area depends on how each country’s data are collected. Similarly, national data may fail to show flood effects at all (Lesk et al., 2016), because a loss such as 2017 is confined to a few districts. Our results differ from the Kansas wheat findings (Obembe et al., 2021) and resemble those on harvested ratios (Cui, 2020), which suggests that the answer depends on the crop, hazard and data system.</w:t>
       </w:r>
     </w:p>
-    <w:bookmarkEnd w:id="59"/>
-    <w:bookmarkStart w:id="60" w:name="implications"/>
+    <w:bookmarkEnd w:id="60"/>
+    <w:bookmarkStart w:id="61" w:name="implications"/>
     <w:p>
       <w:pPr>
         <w:pStyle w:val="Heading2"/>
@@ -10219,8 +10303,8 @@
         <w:t xml:space="preserve">If water before harvest is what matters, then the most direct response is to finish harvesting before the flood window. Earlier sowing and short-duration varieties are already recommended for this reason (Hossain et al., 2023), though farmers face barriers to adopting them (Baishakhy et al., 2023). The exploratory timing result supports this direction but does not establish it. Flood-tolerant rice has improved outcomes in north-west Bangladesh (Bairagi et al., 2021), but that evidence does not transfer directly to Boro in the haor, where the threat comes at maturity. Interest in crop insurance exists (Islam et al., 2021), and our results suggest that a payout tied to district yield would not have been triggered in 2017. Any index for the haor should be based on area or on satellite-observed loss.</w:t>
       </w:r>
     </w:p>
-    <w:bookmarkEnd w:id="60"/>
-    <w:bookmarkStart w:id="61" w:name="limitations"/>
+    <w:bookmarkEnd w:id="61"/>
+    <w:bookmarkStart w:id="62" w:name="limitations"/>
     <w:p>
       <w:pPr>
         <w:pStyle w:val="Heading2"/>
@@ -10234,12 +10318,12 @@
         <w:pStyle w:val="FirstParagraph"/>
       </w:pPr>
       <w:r>
-        <w:t xml:space="preserve">The study covers 15 years and few large flash floods, and one event dominates, so the findings describe these events and do not give a general law. Floods are not randomly assigned. BBS harvested area comes from official estimates, which we checked with independent evidence only partly, and only for large events. The Boro mask relies on a fixed NDVI rule and a static cropland map, is not validated with field data, and has noisy yearly totals. Sentinel-1 has fewer scenes before 2017, and optical records such as JRC can miss short floods that radar observes (Uddin et al., 2019; Twele et al., 2016). Flood fractions in the main models cover whole districts, and the required rice-only check weakened the estimates. Satellite crop loss cannot separate destruction from early harvest. Cold-stress thresholds are provisional. The risk index omits adaptive capacity and salinity (Dasgupta et al., 2018), so it is a partial picture, and its rank ranges are wide. It should guide where to look more closely, and should not be used as an allocation rule.</w:t>
-      </w:r>
-    </w:p>
-    <w:bookmarkEnd w:id="61"/>
+        <w:t xml:space="preserve">The study covers 15 years and few large flash floods, and one event dominates, so the findings describe these events and do not give a general law. Floods are not randomly assigned. BBS harvested area comes from official estimates, which we checked with independent evidence only partly, and only for large events, and values such as Chandpur’s in 2017 remain unexplained. The analysis plan has no public timestamp from before the results. The Boro mask relies on a fixed NDVI rule and a static cropland map, is not validated with field data, and has noisy yearly totals. Sentinel-1 has fewer scenes before 2017, and optical records such as JRC can miss short floods that radar observes (Uddin et al., 2019; Twele et al., 2016). Flood fractions in the main models cover whole districts, and the required rice-only check weakened the estimates. Satellite crop loss cannot separate destruction from early harvest. Cold-stress thresholds are provisional. The risk index omits adaptive capacity and salinity (Dasgupta et al., 2018), so it is a partial picture, and its rank ranges are wide. It should guide where to look more closely, and should not be used as an allocation rule.</w:t>
+      </w:r>
+    </w:p>
     <w:bookmarkEnd w:id="62"/>
-    <w:bookmarkStart w:id="63" w:name="conclusion"/>
+    <w:bookmarkEnd w:id="63"/>
+    <w:bookmarkStart w:id="64" w:name="conclusion"/>
     <w:p>
       <w:pPr>
         <w:pStyle w:val="Heading1"/>
@@ -10253,11 +10337,11 @@
         <w:pStyle w:val="FirstParagraph"/>
       </w:pPr>
       <w:r>
-        <w:t xml:space="preserve">Using printed BBS statistics for all 64 districts and an analysis plan fixed in advance, we asked whether flash floods reduce Boro rice through harvested area rather than yield. For the 2017 flood the answer is clearly yes: haor area and production fell by about a third, yield barely moved, and independent evidence supports the loss. As a general rule the answer is only suggestive, because the estimates rest on 2016 and 2017, and other large floods left no fall in area. Flood timing is the likely reason, but that evidence is exploratory and rests on one event. The practical lesson is that yield alone can miss the largest flood losses in this system, so flood assessment and risk indices should also use harvested area and production.</w:t>
-      </w:r>
-    </w:p>
-    <w:bookmarkEnd w:id="63"/>
-    <w:bookmarkStart w:id="64" w:name="credit-authorship-contribution-statement"/>
+        <w:t xml:space="preserve">Using printed BBS statistics for all 64 districts and a written analysis plan, we asked whether flash floods reduce Boro rice through harvested area rather than yield. For the 2017 flood the answer is clearly yes: haor area and production fell by about a third, yield barely moved, and independent evidence supports the loss. As a general rule the answer is only suggestive, because the estimates rest on 2016 and 2017, and other large floods left no fall in area. Flood timing is the likely reason, but that evidence is exploratory and rests on one event. The practical lesson is that yield alone can miss the largest flood losses in this system, so flood assessment and risk indices should also use harvested area and production.</w:t>
+      </w:r>
+    </w:p>
+    <w:bookmarkEnd w:id="64"/>
+    <w:bookmarkStart w:id="65" w:name="credit-authorship-contribution-statement"/>
     <w:p>
       <w:pPr>
         <w:pStyle w:val="Heading1"/>
@@ -10274,8 +10358,8 @@
         <w:t xml:space="preserve">Tasnim Ahmad Mumu: Conceptualization, Methodology, Software, Validation, Formal analysis, Investigation, Data curation, Writing – original draft, Writing – review &amp; editing, Visualization. Rezaul Karim: Supervision, Methodology, Validation, Writing – review &amp; editing.</w:t>
       </w:r>
     </w:p>
-    <w:bookmarkEnd w:id="64"/>
-    <w:bookmarkStart w:id="65" w:name="funding"/>
+    <w:bookmarkEnd w:id="65"/>
+    <w:bookmarkStart w:id="66" w:name="funding"/>
     <w:p>
       <w:pPr>
         <w:pStyle w:val="Heading1"/>
@@ -10292,8 +10376,8 @@
         <w:t xml:space="preserve">This research did not receive any specific grant from funding agencies in the public, commercial, or not-for-profit sectors.</w:t>
       </w:r>
     </w:p>
-    <w:bookmarkEnd w:id="65"/>
-    <w:bookmarkStart w:id="66" w:name="declaration-of-competing-interest"/>
+    <w:bookmarkEnd w:id="66"/>
+    <w:bookmarkStart w:id="67" w:name="declaration-of-competing-interest"/>
     <w:p>
       <w:pPr>
         <w:pStyle w:val="Heading1"/>
@@ -10310,8 +10394,8 @@
         <w:t xml:space="preserve">The authors declare that they have no known competing financial interests or personal relationships that could have appeared to influence the work reported in this paper.</w:t>
       </w:r>
     </w:p>
-    <w:bookmarkEnd w:id="66"/>
-    <w:bookmarkStart w:id="67" w:name="X1f74eb43af444059c7518034463b6c89b1cacf4"/>
+    <w:bookmarkEnd w:id="67"/>
+    <w:bookmarkStart w:id="68" w:name="X1f74eb43af444059c7518034463b6c89b1cacf4"/>
     <w:p>
       <w:pPr>
         <w:pStyle w:val="Heading1"/>
@@ -10328,8 +10412,8 @@
         <w:t xml:space="preserve">During the preparation of this work the authors used Claude (Anthropic) to assist with code development, data validation and analysis scripts, and drafting and editing of the manuscript text. After using this tool, the authors reviewed and edited the content as needed and take full responsibility for the content of the published article.</w:t>
       </w:r>
     </w:p>
-    <w:bookmarkEnd w:id="67"/>
-    <w:bookmarkStart w:id="68" w:name="data-availability"/>
+    <w:bookmarkEnd w:id="68"/>
+    <w:bookmarkStart w:id="69" w:name="data-availability"/>
     <w:p>
       <w:pPr>
         <w:pStyle w:val="Heading1"/>
@@ -10346,8 +10430,8 @@
         <w:t xml:space="preserve">The panel is archived at https://doi.org/10.5281/zenodo.23795046. The derived data remain subject to the terms of their sources. The BBS yearbook PDFs and the GADM v4.1 boundaries (GADM, 2022) are not redistributed and must be obtained from the Bangladesh Bureau of Statistics and gadm.org. Code, notebooks, the analysis plan and the Earth Engine extracts for this paper are in the repository given in the Software and data availability section.</w:t>
       </w:r>
     </w:p>
-    <w:bookmarkEnd w:id="68"/>
-    <w:bookmarkStart w:id="69" w:name="references"/>
+    <w:bookmarkEnd w:id="69"/>
+    <w:bookmarkStart w:id="70" w:name="references"/>
     <w:p>
       <w:pPr>
         <w:pStyle w:val="Heading1"/>
@@ -10369,6 +10453,14 @@
         <w:pStyle w:val="BodyText"/>
       </w:pPr>
       <w:r>
+        <w:t xml:space="preserve">Ahmed, M.R., 2024. How to Enhance Resilience Against the Adverse Effects of Climate Change: Evidence from Boro Rice Farmers in Northeast Bangladesh. Food and Energy Security 13 (6), e70028. https://doi.org/10.1002/fes3.70028</w:t>
+      </w:r>
+    </w:p>
+    <w:p>
+      <w:pPr>
+        <w:pStyle w:val="BodyText"/>
+      </w:pPr>
+      <w:r>
         <w:t xml:space="preserve">Ahmed, M., Rahaman, K., Kok, A., Hassan, Q., 2017. Remote Sensing-Based Quantification of the Impact of Flash Flooding on the Rice Production: A Case Study over Northeastern Bangladesh. Sensors 17 (10), 2347. https://doi.org/10.3390/s17102347</w:t>
       </w:r>
     </w:p>
@@ -10377,7 +10469,7 @@
         <w:pStyle w:val="BodyText"/>
       </w:pPr>
       <w:r>
-        <w:t xml:space="preserve">Ahmed, M.R., 2024. How to Enhance Resilience Against the Adverse Effects of Climate Change: Evidence from Boro Rice Farmers in Northeast Bangladesh. Food and Energy Security 13 (6), e70028. https://doi.org/10.1002/fes3.70028</w:t>
+        <w:t xml:space="preserve">Alam, M.S., Kalpoma, K., Karim, M.S., Al Sefat, A., Kudoh, J.-i., 2019. Boro rice yield estimation model using MODIS NDVI data for Bangladesh. In: IGARSS 2019 - 2019 IEEE International Geoscience and Remote Sensing Symposium, 7330–7333. https://doi.org/10.1109/igarss.2019.8899084</w:t>
       </w:r>
     </w:p>
     <w:p>
@@ -10385,7 +10477,7 @@
         <w:pStyle w:val="BodyText"/>
       </w:pPr>
       <w:r>
-        <w:t xml:space="preserve">Alam, M.S., Kalpoma, K.A.Z.I., Karim, M.S., Al Sefat, A., Kudoh, J.-i., 2019. Boro Rice Yield Estimation Model Using Modis Ndvi Data for Bangladesh. In: IGARSS 2019 - 2019 IEEE International Geoscience and Remote Sensing Symposium, 7330–7333. https://doi.org/10.1109/igarss.2019.8899084</w:t>
+        <w:t xml:space="preserve">Amin, M., Zhang, J., Yang, M., 2015. Effects of Climate Change on the Yield and Cropping Area of Major Food Crops: A Case of Bangladesh. Sustainability 7 (1), 898–915. https://doi.org/10.3390/su7010898</w:t>
       </w:r>
     </w:p>
     <w:p>
@@ -10393,7 +10485,7 @@
         <w:pStyle w:val="BodyText"/>
       </w:pPr>
       <w:r>
-        <w:t xml:space="preserve">Amin, M., Zhang, J., Yang, M., 2015. Effects of Climate Change on the Yield and Cropping Area of Major Food Crops: A Case of Bangladesh. Sustainability 7 (1), 898–915. https://doi.org/10.3390/su7010898</w:t>
+        <w:t xml:space="preserve">Anselin, L., 1995. Local Indicators of Spatial Association—LISA. Geographical Analysis 27 (2), 93–115. https://doi.org/10.1111/j.1538-4632.1995.tb00338.x</w:t>
       </w:r>
     </w:p>
     <w:p>
@@ -10401,7 +10493,7 @@
         <w:pStyle w:val="BodyText"/>
       </w:pPr>
       <w:r>
-        <w:t xml:space="preserve">Anselin, L., 1995. Local Indicators of Spatial Association—LISA. Geographical Analysis 27 (2), 93–115. https://doi.org/10.1111/j.1538-4632.1995.tb00338.x</w:t>
+        <w:t xml:space="preserve">Asada, H., Matsumoto, J., Rahman, R., 2005. Impact of Recent Severe Floods on Rice Production in Bangladesh. Geographical Review of Japan 78 (12), 783–793. https://doi.org/10.4157/grj.78.783</w:t>
       </w:r>
     </w:p>
     <w:p>
@@ -10409,7 +10501,7 @@
         <w:pStyle w:val="BodyText"/>
       </w:pPr>
       <w:r>
-        <w:t xml:space="preserve">Asada, H., Matsumoto, J., Rahman, R., 2005. Impact of Recent Severe Floods on Rice Production in Bangladesh. Geographical Review of Japan 78 (12), 783–793. https://doi.org/10.4157/grj.78.783</w:t>
+        <w:t xml:space="preserve">Auffhammer, M., Hsiang, S.M., Schlenker, W., Sobel, A., 2013. Using Weather Data and Climate Model Output in Economic Analyses of Climate Change. Review of Environmental Economics and Policy 7 (2), 181–198. https://doi.org/10.1093/reep/ret016</w:t>
       </w:r>
     </w:p>
     <w:p>
@@ -10417,7 +10509,7 @@
         <w:pStyle w:val="BodyText"/>
       </w:pPr>
       <w:r>
-        <w:t xml:space="preserve">Auffhammer, M., Hsiang, S.M., Schlenker, W., Sobel, A., 2013. Using Weather Data and Climate Model Output in Economic Analyses of Climate Change. Review of Environmental Economics and Policy 7 (2), 181–198. https://doi.org/10.1093/reep/ret016</w:t>
+        <w:t xml:space="preserve">Bairagi, S., Bhandari, H., Kumar Das, S., Mohanty, S., 2021. Flood-tolerant rice improves climate resilience, profitability, and household consumption in Bangladesh. Food Policy 105, 102183. https://doi.org/10.1016/j.foodpol.2021.102183</w:t>
       </w:r>
     </w:p>
     <w:p>
@@ -10425,7 +10517,7 @@
         <w:pStyle w:val="BodyText"/>
       </w:pPr>
       <w:r>
-        <w:t xml:space="preserve">Bairagi, S., Bhandari, H., Kumar Das, S., Mohanty, S., 2021. Flood-tolerant rice improves climate resilience, profitability, and household consumption in Bangladesh. Food Policy 105, 102183. https://doi.org/10.1016/j.foodpol.2021.102183</w:t>
+        <w:t xml:space="preserve">Baishakhy, S.D., Islam, M.A., Kamruzzaman, M., 2023. Overcoming barriers to adapt rice farming to recurring flash floods in haor wetlands of Bangladesh. Heliyon 9 (3), e14011. https://doi.org/10.1016/j.heliyon.2023.e14011</w:t>
       </w:r>
     </w:p>
     <w:p>
@@ -10433,7 +10525,7 @@
         <w:pStyle w:val="BodyText"/>
       </w:pPr>
       <w:r>
-        <w:t xml:space="preserve">Baishakhy, S.D., Islam, M.A., Kamruzzaman, M., 2023. Overcoming barriers to adapt rice farming to recurring flash floods in haor wetlands of Bangladesh. Heliyon 9 (3), e14011. https://doi.org/10.1016/j.heliyon.2023.e14011</w:t>
+        <w:t xml:space="preserve">Banerjee, L., 2010. Effects of Flood on Agricultural Productivity in Bangladesh. Oxford Development Studies 38 (3), 339–356. https://doi.org/10.1080/13600818.2010.505681</w:t>
       </w:r>
     </w:p>
     <w:p>
@@ -10441,7 +10533,7 @@
         <w:pStyle w:val="BodyText"/>
       </w:pPr>
       <w:r>
-        <w:t xml:space="preserve">Banerjee, L., 2010. Effects of Flood on Agricultural Productivity in Bangladesh. Oxford Development Studies 38 (3), 339–356. https://doi.org/10.1080/13600818.2010.505681</w:t>
+        <w:t xml:space="preserve">Bangladesh Bureau of Statistics, 2026. Yearbook of Agricultural Statistics-2025 (37th series). Statistics and Informatics Division, Ministry of Planning, Dhaka.</w:t>
       </w:r>
     </w:p>
     <w:p>
@@ -10449,7 +10541,7 @@
         <w:pStyle w:val="BodyText"/>
       </w:pPr>
       <w:r>
-        <w:t xml:space="preserve">Bangladesh Bureau of Statistics, 2026. Yearbook of Agricultural Statistics-2025 (37th series). Statistics and Informatics Division, Ministry of Planning, Dhaka.</w:t>
+        <w:t xml:space="preserve">Benjamini, Y., Hochberg, Y., 1995. Controlling the False Discovery Rate: A Practical and Powerful Approach to Multiple Testing. Journal of the Royal Statistical Society Series B: Statistical Methodology 57 (1), 289–300. https://doi.org/10.1111/j.2517-6161.1995.tb02031.x</w:t>
       </w:r>
     </w:p>
     <w:p>
@@ -10457,7 +10549,7 @@
         <w:pStyle w:val="BodyText"/>
       </w:pPr>
       <w:r>
-        <w:t xml:space="preserve">Benjamini, Y., Hochberg, Y., 1995. Controlling the False Discovery Rate: A Practical and Powerful Approach to Multiple Testing. Journal of the Royal Statistical Society Series B: Statistical Methodology 57 (1), 289–300. https://doi.org/10.1111/j.2517-6161.1995.tb02031.x</w:t>
+        <w:t xml:space="preserve">Blanc, E., Schlenker, W., 2017. The Use of Panel Models in Assessments of Climate Impacts on Agriculture. Review of Environmental Economics and Policy 11 (2), 258–279. https://doi.org/10.1093/reep/rex016</w:t>
       </w:r>
     </w:p>
     <w:p>
@@ -10473,7 +10565,7 @@
         <w:pStyle w:val="BodyText"/>
       </w:pPr>
       <w:r>
-        <w:t xml:space="preserve">Blanc, E., Schlenker, W., 2017. The Use of Panel Models in Assessments of Climate Impacts on Agriculture. Review of Environmental Economics and Policy 11 (2), 258–279. https://doi.org/10.1093/reep/rex016</w:t>
+        <w:t xml:space="preserve">Conley, T.G., 1999. GMM estimation with cross sectional dependence. Journal of Econometrics 92 (1), 1–45. https://doi.org/10.1016/s0304-4076(98)00084-0</w:t>
       </w:r>
     </w:p>
     <w:p>
@@ -10481,7 +10573,7 @@
         <w:pStyle w:val="BodyText"/>
       </w:pPr>
       <w:r>
-        <w:t xml:space="preserve">Conley, T.G., 1999. GMM estimation with cross sectional dependence. Journal of Econometrics 92 (1), 1–45. https://doi.org/10.1016/s0304-4076(98)00084-0</w:t>
+        <w:t xml:space="preserve">Conley, T.G., Taber, C.R., 2011. Inference with “Difference in Differences” with a Small Number of Policy Changes. Review of Economics and Statistics 93 (1), 113–125. https://doi.org/10.1162/REST_a_00049</w:t>
       </w:r>
     </w:p>
     <w:p>
@@ -10489,7 +10581,7 @@
         <w:pStyle w:val="BodyText"/>
       </w:pPr>
       <w:r>
-        <w:t xml:space="preserve">Conley, T.G., Taber, C.R., 2011. Inference with “Difference in Differences” with a Small Number of Policy Changes. Review of Economics and Statistics 93 (1), 113–125. https://doi.org/10.1162/REST_a_00049</w:t>
+        <w:t xml:space="preserve">Cui, X., 2020. Beyond Yield Response: Weather Shocks and Crop Abandonment. Journal of the Association of Environmental and Resource Economists 7 (5), 901–932. https://doi.org/10.1086/709859</w:t>
       </w:r>
     </w:p>
     <w:p>
@@ -10497,7 +10589,7 @@
         <w:pStyle w:val="BodyText"/>
       </w:pPr>
       <w:r>
-        <w:t xml:space="preserve">Cui, X., 2020. Beyond Yield Response: Weather Shocks and Crop Abandonment. Journal of the Association of Environmental and Resource Economists 7 (5), 901–932. https://doi.org/10.1086/709859</w:t>
+        <w:t xml:space="preserve">Dasgupta, S., Hossain, M.M., Huq, M., Wheeler, D., 2018. Climate Change, Salinization and High-Yield Rice Production in Coastal Bangladesh. Agricultural and Resource Economics Review 47 (1), 66–89. https://doi.org/10.1017/age.2017.14</w:t>
       </w:r>
     </w:p>
     <w:p>
@@ -10505,7 +10597,7 @@
         <w:pStyle w:val="BodyText"/>
       </w:pPr>
       <w:r>
-        <w:t xml:space="preserve">Dasgupta, S., Hossain, M.M., Huq, M., Wheeler, D., 2018. Climate Change, Salinization and High-Yield Rice Production in Coastal Bangladesh. Agricultural and Resource Economics Review 47 (1), 66–89. https://doi.org/10.1017/age.2017.14</w:t>
+        <w:t xml:space="preserve">Dey, N.C., Parvez, M., Islam, M.R., 2021. A study on the impact of the 2017 early monsoon flash flood: Potential measures to safeguard livelihoods from extreme climate events in the haor area of Bangladesh. International Journal of Disaster Risk Reduction 59, 102247. https://doi.org/10.1016/j.ijdrr.2021.102247</w:t>
       </w:r>
     </w:p>
     <w:p>
@@ -10513,7 +10605,7 @@
         <w:pStyle w:val="BodyText"/>
       </w:pPr>
       <w:r>
-        <w:t xml:space="preserve">Dey, N.C., Parvez, M., Islam, M.R., 2021. A study on the impact of the 2017 early monsoon flash flood: Potential measures to safeguard livelihoods from extreme climate events in the haor area of Bangladesh. International Journal of Disaster Risk Reduction 59, 102247. https://doi.org/10.1016/j.ijdrr.2021.102247</w:t>
+        <w:t xml:space="preserve">Didan, K., 2021. MODIS/Terra Vegetation Indices 16-Day L3 Global 250m SIN Grid V061. NASA Land Processes Distributed Active Archive Center. https://doi.org/10.5067/MODIS/MOD13Q1.061</w:t>
       </w:r>
     </w:p>
     <w:p>
@@ -10521,7 +10613,7 @@
         <w:pStyle w:val="BodyText"/>
       </w:pPr>
       <w:r>
-        <w:t xml:space="preserve">Didan, K., 2021. MODIS/Terra Vegetation Indices 16-Day L3 Global 250m SIN Grid V061. NASA Land Processes Distributed Active Archive Center. https://doi.org/10.5067/MODIS/MOD13Q1.061</w:t>
+        <w:t xml:space="preserve">Driscoll, J.C., Kraay, A.C., 1998. Consistent Covariance Matrix Estimation with Spatially Dependent Panel Data. Review of Economics and Statistics 80 (4), 549–560. https://doi.org/10.1162/003465398557825</w:t>
       </w:r>
     </w:p>
     <w:p>
@@ -10529,7 +10621,7 @@
         <w:pStyle w:val="BodyText"/>
       </w:pPr>
       <w:r>
-        <w:t xml:space="preserve">Driscoll, J.C., Kraay, A.C., 1998. Consistent Covariance Matrix Estimation with Spatially Dependent Panel Data. Review of Economics and Statistics 80 (4), 549–560. https://doi.org/10.1162/003465398557825</w:t>
+        <w:t xml:space="preserve">GADM, 2022. Database of Global Administrative Areas, version 4.1. https://gadm.org.</w:t>
       </w:r>
     </w:p>
     <w:p>
@@ -10537,7 +10629,7 @@
         <w:pStyle w:val="BodyText"/>
       </w:pPr>
       <w:r>
-        <w:t xml:space="preserve">GADM, 2022. Database of Global Administrative Areas, version 4.1. https://gadm.org.</w:t>
+        <w:t xml:space="preserve">Gorelick, N., Hancher, M., Dixon, M., Ilyushchenko, S., Thau, D., Moore, R., 2017. Google Earth Engine: Planetary-scale geospatial analysis for everyone. Remote Sensing of Environment 202, 18–27. https://doi.org/10.1016/j.rse.2017.06.031</w:t>
       </w:r>
     </w:p>
     <w:p>
@@ -10545,7 +10637,7 @@
         <w:pStyle w:val="BodyText"/>
       </w:pPr>
       <w:r>
-        <w:t xml:space="preserve">Gorelick, N., Hancher, M., Dixon, M., Ilyushchenko, S., Thau, D., Moore, R., 2017. Google Earth Engine: Planetary-scale geospatial analysis for everyone. Remote Sensing of Environment 202, 18–27. https://doi.org/10.1016/j.rse.2017.06.031</w:t>
+        <w:t xml:space="preserve">Guiteras, R., Jina, A., Mobarak, A.M., 2015. Satellites, Self-reports, and Submersion: Exposure to Floods in Bangladesh. American Economic Review 105 (5), 232–236. https://doi.org/10.1257/aer.p20151095</w:t>
       </w:r>
     </w:p>
     <w:p>
@@ -10553,7 +10645,7 @@
         <w:pStyle w:val="BodyText"/>
       </w:pPr>
       <w:r>
-        <w:t xml:space="preserve">Guiteras, R., Jina, A., Mobarak, A.M., 2015. Satellites, Self-reports, and Submersion: Exposure to Floods in Bangladesh. American Economic Review 105 (5), 232–236. https://doi.org/10.1257/aer.p20151095</w:t>
+        <w:t xml:space="preserve">Hasan, M.M., Sarker, M.A.R., Gow, J., 2016. Assessment of climate change impacts on Aman and Boro rice yields in Bangladesh. Climate Change Economics 07 (03), 1650008. https://doi.org/10.1142/s2010007816500081</w:t>
       </w:r>
     </w:p>
     <w:p>
@@ -10561,7 +10653,7 @@
         <w:pStyle w:val="BodyText"/>
       </w:pPr>
       <w:r>
-        <w:t xml:space="preserve">Hasan, M.M., Sarker, M.A.R., GOW, J.E.F.F., 2016. Assessment of climate change impacts on aman and boro rice yields in bangladesh. Climate Change Economics 07 (03), 1650008. https://doi.org/10.1142/s2010007816500081</w:t>
+        <w:t xml:space="preserve">Hassan, S.M.K., 2019. Impacts of flooding on the rice production of Bangladesh: a panel data study. Thesis, Colorado State University. https://mountainscholar.org/handle/10217/197396.</w:t>
       </w:r>
     </w:p>
     <w:p>
@@ -10569,7 +10661,7 @@
         <w:pStyle w:val="BodyText"/>
       </w:pPr>
       <w:r>
-        <w:t xml:space="preserve">Hassan, S.M.K., 2019. Impacts of flooding on the rice production of Bangladesh: a panel data study. Thesis, Colorado State University. https://mountainscholar.org/handle/10217/197396.</w:t>
+        <w:t xml:space="preserve">Hossain, M., Biswas, P., Islam, M.R., 2023. Cold-Tolerant and Short-Duration Rice (Oryza sativa L.) for Sustainable Food Security of the Flash Flood-Prone Haor Wetlands of Bangladesh. Sustainability 15 (24), 16873. https://doi.org/10.3390/su152416873</w:t>
       </w:r>
     </w:p>
     <w:p>
@@ -10577,7 +10669,7 @@
         <w:pStyle w:val="BodyText"/>
       </w:pPr>
       <w:r>
-        <w:t xml:space="preserve">Hossain, M., Biswas, P., Islam, M.R., 2023. Cold-Tolerant and Short-Duration Rice (Oryza sativa L.) for Sustainable Food Security of the Flash Flood-Prone Haor Wetlands of Bangladesh. Sustainability 15 (24), 16873. https://doi.org/10.3390/su152416873</w:t>
+        <w:t xml:space="preserve">Hsiang, S., 2016. Climate Econometrics. Annual Review of Resource Economics 8 (1), 43–75. https://doi.org/10.1146/annurev-resource-100815-095343</w:t>
       </w:r>
     </w:p>
     <w:p>
@@ -10585,7 +10677,7 @@
         <w:pStyle w:val="BodyText"/>
       </w:pPr>
       <w:r>
-        <w:t xml:space="preserve">Hsiang, S., 2016. Climate Econometrics. National Bureau of Economic Research. https://doi.org/10.3386/w22181</w:t>
+        <w:t xml:space="preserve">Islam, D.I., Rahman, A., Sarker, M.S.R., Luo, J., Liang, H., 2021. Factors affecting farmers’ willingness to adopt crop insurance to manage disaster risk: evidence from Bangladesh. International Food and Agribusiness Management Review 24 (3), 463–480. https://doi.org/10.22434/ifamr2019.0190</w:t>
       </w:r>
     </w:p>
     <w:p>
@@ -10593,7 +10685,7 @@
         <w:pStyle w:val="BodyText"/>
       </w:pPr>
       <w:r>
-        <w:t xml:space="preserve">Islam, D.I., Rahman, A., Sarker, M.S.R., Luo, J., Liang, H., 2021. Factors affecting farmers’ willingness to adopt crop insurance to manage disaster risk: evidence from Bangladesh. International Food and Agribusiness Management Review 24 (3), 463–480. https://doi.org/10.22434/ifamr2019.0190</w:t>
+        <w:t xml:space="preserve">Jagadish, S., Craufurd, P.Q., Wheeler, T.R., 2007. High temperature stress and spikelet fertility in rice (Oryza sativa L.). Journal of Experimental Botany 58 (7), 1627–1635. https://doi.org/10.1093/jxb/erm003</w:t>
       </w:r>
     </w:p>
     <w:p>
@@ -10601,7 +10693,7 @@
         <w:pStyle w:val="BodyText"/>
       </w:pPr>
       <w:r>
-        <w:t xml:space="preserve">Jagadish, S.V.K., Craufurd, P.Q., Wheeler, T.R., 2007. High temperature stress and spikelet fertility in rice (Oryza sativa L.). Journal of Experimental Botany 58 (7), 1627–1635. https://doi.org/10.1093/jxb/erm003</w:t>
+        <w:t xml:space="preserve">Kamruzzaman, M., Shaw, R., 2018. Flood and Sustainable Agriculture in the Haor Basin of Bangladesh: A Review Paper. Universal Journal of Agricultural Research 6 (1), 40–49. https://doi.org/10.13189/ujar.2018.060106</w:t>
       </w:r>
     </w:p>
     <w:p>
@@ -10609,7 +10701,7 @@
         <w:pStyle w:val="BodyText"/>
       </w:pPr>
       <w:r>
-        <w:t xml:space="preserve">Kamruzzaman, M., Shaw, R., 2018. Flood and Sustainable Agriculture in the Haor Basin of Bangladesh: A Review Paper. Universal Journal of Agricultural Research 6 (1), 40–49. https://doi.org/10.13189/ujar.2018.060106</w:t>
+        <w:t xml:space="preserve">Khan, M., Mia, M.Y., Hossain, M.R., 2012. Impacts of Flood on Crop Production in Haor Areas of Two Upazillas in Kishoregonj. Journal of Environmental Science and Natural Resources 5 (1), 193–198. https://doi.org/10.3329/jesnr.v5i1.11581</w:t>
       </w:r>
     </w:p>
     <w:p>
@@ -10617,7 +10709,7 @@
         <w:pStyle w:val="BodyText"/>
       </w:pPr>
       <w:r>
-        <w:t xml:space="preserve">Khan, M.N.H., Mia, M.Y., Hossain, M.R., 2012. Impacts of Flood on Crop Production in Haor Areas of Two Upazillas in Kishoregonj. Journal of Environmental Science and Natural Resources 5 (1), 193–198. https://doi.org/10.3329/jesnr.v5i1.11581</w:t>
+        <w:t xml:space="preserve">Lesk, C., Rowhani, P., Ramankutty, N., 2016. Influence of extreme weather disasters on global crop production. Nature 529 (7584), 84–87. https://doi.org/10.1038/nature16467</w:t>
       </w:r>
     </w:p>
     <w:p>
@@ -10625,7 +10717,7 @@
         <w:pStyle w:val="BodyText"/>
       </w:pPr>
       <w:r>
-        <w:t xml:space="preserve">Lesk, C., Rowhani, P., Ramankutty, N., 2016. Influence of extreme weather disasters on global crop production. Nature 529 (7584), 84–87. https://doi.org/10.1038/nature16467</w:t>
+        <w:t xml:space="preserve">Li, Z., Rosa, L., Gorelick, S., 2025. Severe floods significantly reduce global rice yields. Science Advances 11 (46), eadx7799. https://doi.org/10.1126/sciadv.adx7799</w:t>
       </w:r>
     </w:p>
     <w:p>
@@ -10633,7 +10725,7 @@
         <w:pStyle w:val="BodyText"/>
       </w:pPr>
       <w:r>
-        <w:t xml:space="preserve">Li, Z., Rosa, L., Gorelick, S., 2025. Severe floods significantly reduce global rice yields. Science Advances 11 (46), eadx7799. https://doi.org/10.1126/sciadv.adx7799</w:t>
+        <w:t xml:space="preserve">MacKinnon, J.G., Webb, M.D., 2017. Wild Bootstrap Inference for Wildly Different Cluster Sizes. Journal of Applied Econometrics 32 (2), 233–254. https://doi.org/10.1002/jae.2508</w:t>
       </w:r>
     </w:p>
     <w:p>
@@ -10641,7 +10733,7 @@
         <w:pStyle w:val="BodyText"/>
       </w:pPr>
       <w:r>
-        <w:t xml:space="preserve">MacKinnon, J.G., Webb, M.D., 2017. Wild Bootstrap Inference for Wildly Different Cluster Sizes. Journal of Applied Econometrics 32 (2), 233–254. https://doi.org/10.1002/jae.2508</w:t>
+        <w:t xml:space="preserve">MacKinnon, J.G., Webb, M.D., 2018. The wild bootstrap for few (treated) clusters. The Econometrics Journal 21 (2), 114–135. https://doi.org/10.1111/ectj.12107</w:t>
       </w:r>
     </w:p>
     <w:p>
@@ -10649,7 +10741,7 @@
         <w:pStyle w:val="BodyText"/>
       </w:pPr>
       <w:r>
-        <w:t xml:space="preserve">MacKinnon, J.G., Webb, M.D., 2018. The wild bootstrap for few (treated) clusters. The Econometrics Journal 21 (2), 114–135. https://doi.org/10.1111/ectj.12107</w:t>
+        <w:t xml:space="preserve">MacKinnon, J.G., Webb, M.D., 2020. Randomization inference for difference-in-differences with few treated clusters. Journal of Econometrics 218 (2), 435–450. https://doi.org/10.1016/j.jeconom.2020.04.024</w:t>
       </w:r>
     </w:p>
     <w:p>
@@ -10657,7 +10749,7 @@
         <w:pStyle w:val="BodyText"/>
       </w:pPr>
       <w:r>
-        <w:t xml:space="preserve">MacKinnon, J.G., Webb, M.D., 2020. Randomization inference for difference-in-differences with few treated clusters. Journal of Econometrics 218 (2), 435–450. https://doi.org/10.1016/j.jeconom.2020.04.024</w:t>
+        <w:t xml:space="preserve">Mondal, S., Akter, L., Hiya, H.J., Farukh, M.A., 2021. Effects of 2017 Early Flash Flooding on Agriculture in Haor Areas of Sunamganj. Journal of Environmental Science and Natural Resources 12 (1-2), 117–125. https://doi.org/10.3329/jesnr.v12i1-2.52007</w:t>
       </w:r>
     </w:p>
     <w:p>
@@ -10665,7 +10757,7 @@
         <w:pStyle w:val="BodyText"/>
       </w:pPr>
       <w:r>
-        <w:t xml:space="preserve">Mondal, S., Akter, L., Hiya, H.J., Farukh, M.A., 2021. Effects of 2017 Early Flash Flooding on Agriculture in Haor Areas of Sunamganj. Journal of Environmental Science and Natural Resources 12 (1-2), 117–125. https://doi.org/10.3329/jesnr.v12i1-2.52007</w:t>
+        <w:t xml:space="preserve">Moran, P.A.P., 1950. Notes on continuous stochastic phenomena. Biometrika 37 (1-2), 17–23. https://doi.org/10.1093/biomet/37.1-2.17</w:t>
       </w:r>
     </w:p>
     <w:p>
@@ -10673,7 +10765,7 @@
         <w:pStyle w:val="BodyText"/>
       </w:pPr>
       <w:r>
-        <w:t xml:space="preserve">Moran, P.A.P., 1950. Notes on continuous stochastic phenomena. Biometrika 37 (1-2), 17–23. https://doi.org/10.1093/biomet/37.1-2.17</w:t>
+        <w:t xml:space="preserve">Mosleh, M., Hassan, Q., 2014. Development of a Remote Sensing-Based “Boro” Rice Mapping System. Remote Sensing 6 (3), 1938–1953. https://doi.org/10.3390/rs6031938</w:t>
       </w:r>
     </w:p>
     <w:p>
@@ -10681,7 +10773,7 @@
         <w:pStyle w:val="BodyText"/>
       </w:pPr>
       <w:r>
-        <w:t xml:space="preserve">Mosleh, M., Hassan, Q., 2014. Development of a Remote Sensing-Based “Boro” Rice Mapping System. Remote Sensing 6 (3), 1938–1953. https://doi.org/10.3390/rs6031938</w:t>
+        <w:t xml:space="preserve">Mosleh, M.K., Hassan, Q.K., Chowdhury, E.H., 2016. Development of a remote sensing-based rice yield forecasting model. Spanish Journal of Agricultural Research 14 (3), e0907. https://doi.org/10.5424/sjar/2016143-8347</w:t>
       </w:r>
     </w:p>
     <w:p>
@@ -10689,7 +10781,7 @@
         <w:pStyle w:val="BodyText"/>
       </w:pPr>
       <w:r>
-        <w:t xml:space="preserve">Mosleh, M.K., Hassan, Q.K., Chowdhury, E.H., 2016. Development of a remote sensing-based rice yield forecasting model. Spanish Journal of Agricultural Research 14 (3), e0907. https://doi.org/10.5424/sjar/2016143-8347</w:t>
+        <w:t xml:space="preserve">Mumu, T.A., Karim, R., 2026a. An open, tested data engineering framework for integrating official crop statistics with satellite and climate data: district-level Boro rice in Bangladesh. Manuscript submitted to Environmental Modelling &amp; Software.</w:t>
       </w:r>
     </w:p>
     <w:p>
@@ -10697,7 +10789,7 @@
         <w:pStyle w:val="BodyText"/>
       </w:pPr>
       <w:r>
-        <w:t xml:space="preserve">Mumu, T.A., Karim, R., 2026. bd-boro-data-framework: an open, tested data engineering framework for integrating official crop statistics with satellite and climate data, district-level Boro rice in Bangladesh. Zenodo. https://doi.org/10.5281/zenodo.23795046</w:t>
+        <w:t xml:space="preserve">Mumu, T.A., Karim, R., 2026b. bd-boro-data-framework: an open, tested data engineering framework for integrating official crop statistics with satellite and climate data, district-level Boro rice in Bangladesh. Zenodo. https://doi.org/10.5281/zenodo.23795046</w:t>
       </w:r>
     </w:p>
     <w:p>
@@ -10745,6 +10837,14 @@
         <w:pStyle w:val="BodyText"/>
       </w:pPr>
       <w:r>
+        <w:t xml:space="preserve">Rahman, M.S., Di, L., 2020. A Systematic Review on Case Studies of Remote-Sensing-Based Flood Crop Loss Assessment. Agriculture 10 (4), 131. https://doi.org/10.3390/agriculture10040131</w:t>
+      </w:r>
+    </w:p>
+    <w:p>
+      <w:pPr>
+        <w:pStyle w:val="BodyText"/>
+      </w:pPr>
+      <w:r>
         <w:t xml:space="preserve">Rahman, M.A., Kang, S., Nagabhatla, N., Macnee, R., 2017. Impacts of temperature and rainfall variation on rice productivity in major ecosystems of Bangladesh. Agriculture &amp; Food Security 6 (1), 10. https://doi.org/10.1186/s40066-017-0089-5</w:t>
       </w:r>
     </w:p>
@@ -10753,7 +10853,7 @@
         <w:pStyle w:val="BodyText"/>
       </w:pPr>
       <w:r>
-        <w:t xml:space="preserve">Rahman, M.S., Di, L., 2020. A Systematic Review on Case Studies of Remote-Sensing-Based Flood Crop Loss Assessment. Agriculture 10 (4), 131. https://doi.org/10.3390/agriculture10040131</w:t>
+        <w:t xml:space="preserve">Rahman, M.S., Di, L., Yu, E., Lin, L., Yu, Z., 2021. Remote Sensing Based Rapid Assessment of Flood Crop Damage Using Novel Disaster Vegetation Damage Index (DVDI). International Journal of Disaster Risk Science 12 (1), 90–110. https://doi.org/10.1007/s13753-020-00305-7</w:t>
       </w:r>
     </w:p>
     <w:p>
@@ -10761,7 +10861,7 @@
         <w:pStyle w:val="BodyText"/>
       </w:pPr>
       <w:r>
-        <w:t xml:space="preserve">Rahman, M.S., Di, L., Yu, E., Lin, L., Yu, Z., 2021. Remote Sensing Based Rapid Assessment of Flood Crop Damage Using Novel Disaster Vegetation Damage Index (DVDI). International Journal of Disaster Risk Science 12 (1), 90–110. https://doi.org/10.1007/s13753-020-00305-7</w:t>
+        <w:t xml:space="preserve">Rahman, M.A., Alam, M.S., Sultana, R., Sultana, R., 2025. Assessing the interrelationship between monsoon flood disasters and major crop production in Bangladesh. International Journal of Disaster Risk Reduction 121, 105401. https://doi.org/10.1016/j.ijdrr.2025.105401</w:t>
       </w:r>
     </w:p>
     <w:p>
@@ -10769,7 +10869,7 @@
         <w:pStyle w:val="BodyText"/>
       </w:pPr>
       <w:r>
-        <w:t xml:space="preserve">Rahman, M.A., Alam, M.S., Sultana, R., Sultana, R., 2025. Assessing the interrelationship between monsoon flood disasters and major crop production in Bangladesh. International Journal of Disaster Risk Reduction 121, 105401. https://doi.org/10.1016/j.ijdrr.2025.105401</w:t>
+        <w:t xml:space="preserve">Rashid, M.M., Yasmeen, R., 2018. Cold Injury and Flash Flood Damage in Boro Rice Cultivation in Bangladesh: A Review. Bangladesh Rice Journal 21 (1), 13–25. https://doi.org/10.3329/brj.v21i1.37360</w:t>
       </w:r>
     </w:p>
     <w:p>
@@ -10777,7 +10877,7 @@
         <w:pStyle w:val="BodyText"/>
       </w:pPr>
       <w:r>
-        <w:t xml:space="preserve">Rashid, M.M., Yasmeen, R., 2018. Cold Injury and Flash Flood Damage in Boro Rice Cultivation in Bangladesh: A Review. Bangladesh Rice Journal 21 (1), 13–25. https://doi.org/10.3329/brj.v21i1.37360</w:t>
+        <w:t xml:space="preserve">Saisana, M., Saltelli, A., Tarantola, S., 2005. Uncertainty and Sensitivity Analysis Techniques as Tools for the Quality Assessment of Composite Indicators. Journal of the Royal Statistical Society Series A: Statistics in Society 168 (2), 307–323. https://doi.org/10.1111/j.1467-985X.2005.00350.x</w:t>
       </w:r>
     </w:p>
     <w:p>
@@ -10785,7 +10885,7 @@
         <w:pStyle w:val="BodyText"/>
       </w:pPr>
       <w:r>
-        <w:t xml:space="preserve">Saisana, M., Saltelli, A., Tarantola, S., 2005. Uncertainty and Sensitivity Analysis Techniques as Tools for the Quality Assessment of Composite Indicators. Journal of the Royal Statistical Society Series A: Statistics in Society 168 (2), 307–323. https://doi.org/10.1111/j.1467-985X.2005.00350.x</w:t>
+        <w:t xml:space="preserve">Santos Silva, J.M.C., Tenreyro, S., 2006. The Log of Gravity. The Review of Economics and Statistics 88 (4), 641–658. https://doi.org/10.1162/rest.88.4.641</w:t>
       </w:r>
     </w:p>
     <w:p>
@@ -10809,7 +10909,7 @@
         <w:pStyle w:val="BodyText"/>
       </w:pPr>
       <w:r>
-        <w:t xml:space="preserve">Silva, J.M.C.S., Tenreyro, S., 2006. The Log of Gravity. The Review of Economics and Statistics 88 (4), 641–658. https://doi.org/10.1162/rest.88.4.641</w:t>
+        <w:t xml:space="preserve">Singha, M., Dong, J., Zhang, G., Xiao, X., 2019. High resolution paddy rice maps in cloud-prone Bangladesh and Northeast India using Sentinel-1 data. Scientific Data 6 (1), 26. https://doi.org/10.1038/s41597-019-0036-3</w:t>
       </w:r>
     </w:p>
     <w:p>
@@ -10817,7 +10917,7 @@
         <w:pStyle w:val="BodyText"/>
       </w:pPr>
       <w:r>
-        <w:t xml:space="preserve">Singha, M., Dong, J., Zhang, G., Xiao, X., 2019. High resolution paddy rice maps in cloud-prone Bangladesh and Northeast India using Sentinel-1 data. Scientific Data 6 (1), 26. https://doi.org/10.1038/s41597-019-0036-3</w:t>
+        <w:t xml:space="preserve">Tate, E., 2012. Social vulnerability indices: a comparative assessment using uncertainty and sensitivity analysis. Natural Hazards 63 (2), 325–347. https://doi.org/10.1007/s11069-012-0152-2</w:t>
       </w:r>
     </w:p>
     <w:p>
@@ -10825,7 +10925,7 @@
         <w:pStyle w:val="BodyText"/>
       </w:pPr>
       <w:r>
-        <w:t xml:space="preserve">Tate, E., 2012. Social vulnerability indices: a comparative assessment using uncertainty and sensitivity analysis. Natural Hazards 63 (2), 325–347. https://doi.org/10.1007/s11069-012-0152-2</w:t>
+        <w:t xml:space="preserve">Torres, R., Snoeij, P., Geudtner, D., Bibby, D., Davidson, M., Attema, E., Potin, P., Rommen, B., Floury, N., Brown, M., et al., 2012. GMES Sentinel-1 mission. Remote Sensing of Environment 120, 9–24. https://doi.org/10.1016/j.rse.2011.05.028</w:t>
       </w:r>
     </w:p>
     <w:p>
@@ -10833,7 +10933,7 @@
         <w:pStyle w:val="BodyText"/>
       </w:pPr>
       <w:r>
-        <w:t xml:space="preserve">Torres, R., Snoeij, P., Geudtner, D., Bibby, D., Davidson, M., Attema, E., Potin, P., Rommen, B., Floury, N., Brown, M., et al., 2012. GMES Sentinel-1 mission. Remote Sensing of Environment 120, 9–24. https://doi.org/10.1016/j.rse.2011.05.028</w:t>
+        <w:t xml:space="preserve">Twele, A., Cao, W., Plank, S., Martinis, S., 2016. Sentinel-1-based flood mapping: a fully automated processing chain. International Journal of Remote Sensing 37 (13), 2990–3004. https://doi.org/10.1080/01431161.2016.1192304</w:t>
       </w:r>
     </w:p>
     <w:p>
@@ -10841,7 +10941,7 @@
         <w:pStyle w:val="BodyText"/>
       </w:pPr>
       <w:r>
-        <w:t xml:space="preserve">Twele, A., Cao, W., Plank, S., Martinis, S., 2016. Sentinel-1-based flood mapping: a fully automated processing chain. International Journal of Remote Sensing 37 (13), 2990–3004. https://doi.org/10.1080/01431161.2016.1192304</w:t>
+        <w:t xml:space="preserve">Uddin, K., Matin, M.A., Meyer, F.J., 2019. Operational Flood Mapping Using Multi-Temporal Sentinel-1 SAR Images: A Case Study from Bangladesh. Remote Sensing 11 (13), 1581. https://doi.org/10.3390/rs11131581</w:t>
       </w:r>
     </w:p>
     <w:p>
@@ -10849,7 +10949,7 @@
         <w:pStyle w:val="BodyText"/>
       </w:pPr>
       <w:r>
-        <w:t xml:space="preserve">Uddin, K., Matin, M.A., Meyer, F.J., 2019. Operational Flood Mapping Using Multi-Temporal Sentinel-1 SAR Images: A Case Study from Bangladesh. Remote Sensing 11 (13), 1581. https://doi.org/10.3390/rs11131581</w:t>
+        <w:t xml:space="preserve">Wei, D., Gephart, J.A., Iizumi, T., Ramankutty, N., Davis, K.F., 2023. Key role of planted and harvested area fluctuations in US crop production shocks. Nature Sustainability 6 (10), 1177–1185. https://doi.org/10.1038/s41893-023-01152-2</w:t>
       </w:r>
     </w:p>
     <w:p>
@@ -10857,19 +10957,11 @@
         <w:pStyle w:val="BodyText"/>
       </w:pPr>
       <w:r>
-        <w:t xml:space="preserve">Wei, D., Davis, K., 2022. Majority of production shocks for major US crops explained by fluctuations in planted and harvested area.. https://doi.org/10.1002/essoar.10510446.1</w:t>
-      </w:r>
-    </w:p>
-    <w:p>
-      <w:pPr>
-        <w:pStyle w:val="BodyText"/>
-      </w:pPr>
-      <w:r>
         <w:t xml:space="preserve">Zanaga, D., Van De Kerchove, R., Daems, D., De Keersmaecker, W., Brockmann, C., Kirches, G., Wevers, J., Cartus, O., Santoro, M., Fritz, S., et al., 2022. ESA WorldCover 10 m 2021 v200. Zenodo. https://doi.org/10.5281/zenodo.7254221</w:t>
       </w:r>
     </w:p>
-    <w:bookmarkEnd w:id="69"/>
-    <w:bookmarkStart w:id="70" w:name="appendix-a.-supplementary-tables"/>
+    <w:bookmarkEnd w:id="70"/>
+    <w:bookmarkStart w:id="71" w:name="appendix-a.-supplementary-tables"/>
     <w:p>
       <w:pPr>
         <w:pStyle w:val="Heading1"/>
@@ -10883,7 +10975,7 @@
         <w:pStyle w:val="FirstParagraph"/>
       </w:pPr>
       <w:r>
-        <w:t xml:space="preserve">Table A.1. Other variants of the area effect, reported without a pass rule. The Poisson model (Silva and Tenreyro, 2006) gives more weight to large districts.</w:t>
+        <w:t xml:space="preserve">Table A.1. Other variants of the area effect, reported without a pass rule. The Poisson model (Santos Silva and Tenreyro, 2006) gives more weight to large districts.</w:t>
       </w:r>
     </w:p>
     <w:tbl>
@@ -11310,6 +11402,234 @@
               <w:pStyle w:val="Compact"/>
             </w:pPr>
             <w:r>
+              <w:t xml:space="preserve">Districts under 15,000 ha left out</w:t>
+            </w:r>
+          </w:p>
+        </w:tc>
+        <w:tc>
+          <w:tcPr/>
+          <w:p>
+            <w:pPr>
+              <w:pStyle w:val="Compact"/>
+            </w:pPr>
+            <w:r>
+              <w:t xml:space="preserve">Sentinel-1</w:t>
+            </w:r>
+          </w:p>
+        </w:tc>
+        <w:tc>
+          <w:tcPr/>
+          <w:p>
+            <w:pPr>
+              <w:pStyle w:val="Compact"/>
+            </w:pPr>
+            <w:r>
+              <w:t xml:space="preserve">−13.8</w:t>
+            </w:r>
+          </w:p>
+        </w:tc>
+        <w:tc>
+          <w:tcPr/>
+          <w:p>
+            <w:pPr>
+              <w:pStyle w:val="Compact"/>
+            </w:pPr>
+            <w:r>
+              <w:t xml:space="preserve">0.001</w:t>
+            </w:r>
+          </w:p>
+        </w:tc>
+        <w:tc>
+          <w:tcPr/>
+          <w:p>
+            <w:pPr>
+              <w:pStyle w:val="Compact"/>
+            </w:pPr>
+            <w:r>
+              <w:t xml:space="preserve">0.004</w:t>
+            </w:r>
+          </w:p>
+        </w:tc>
+      </w:tr>
+      <w:tr>
+        <w:tc>
+          <w:tcPr/>
+          <w:p>
+            <w:pPr>
+              <w:pStyle w:val="Compact"/>
+            </w:pPr>
+            <w:r>
+              <w:t xml:space="preserve">Districts under 15,000 ha left out</w:t>
+            </w:r>
+          </w:p>
+        </w:tc>
+        <w:tc>
+          <w:tcPr/>
+          <w:p>
+            <w:pPr>
+              <w:pStyle w:val="Compact"/>
+            </w:pPr>
+            <w:r>
+              <w:t xml:space="preserve">JRC</w:t>
+            </w:r>
+          </w:p>
+        </w:tc>
+        <w:tc>
+          <w:tcPr/>
+          <w:p>
+            <w:pPr>
+              <w:pStyle w:val="Compact"/>
+            </w:pPr>
+            <w:r>
+              <w:t xml:space="preserve">−6.2</w:t>
+            </w:r>
+          </w:p>
+        </w:tc>
+        <w:tc>
+          <w:tcPr/>
+          <w:p>
+            <w:pPr>
+              <w:pStyle w:val="Compact"/>
+            </w:pPr>
+            <w:r>
+              <w:t xml:space="preserve">0.012</w:t>
+            </w:r>
+          </w:p>
+        </w:tc>
+        <w:tc>
+          <w:tcPr/>
+          <w:p>
+            <w:pPr>
+              <w:pStyle w:val="Compact"/>
+            </w:pPr>
+            <w:r>
+              <w:t xml:space="preserve">0.073</w:t>
+            </w:r>
+          </w:p>
+        </w:tc>
+      </w:tr>
+      <w:tr>
+        <w:tc>
+          <w:tcPr/>
+          <w:p>
+            <w:pPr>
+              <w:pStyle w:val="Compact"/>
+            </w:pPr>
+            <w:r>
+              <w:t xml:space="preserve">Leave out Chandpur</w:t>
+            </w:r>
+          </w:p>
+        </w:tc>
+        <w:tc>
+          <w:tcPr/>
+          <w:p>
+            <w:pPr>
+              <w:pStyle w:val="Compact"/>
+            </w:pPr>
+            <w:r>
+              <w:t xml:space="preserve">Sentinel-1</w:t>
+            </w:r>
+          </w:p>
+        </w:tc>
+        <w:tc>
+          <w:tcPr/>
+          <w:p>
+            <w:pPr>
+              <w:pStyle w:val="Compact"/>
+            </w:pPr>
+            <w:r>
+              <w:t xml:space="preserve">−21.3</w:t>
+            </w:r>
+          </w:p>
+        </w:tc>
+        <w:tc>
+          <w:tcPr/>
+          <w:p>
+            <w:pPr>
+              <w:pStyle w:val="Compact"/>
+            </w:pPr>
+            <w:r>
+              <w:t xml:space="preserve">0.023</w:t>
+            </w:r>
+          </w:p>
+        </w:tc>
+        <w:tc>
+          <w:tcPr/>
+          <w:p>
+            <w:pPr>
+              <w:pStyle w:val="Compact"/>
+            </w:pPr>
+            <w:r>
+              <w:t xml:space="preserve">&lt; 0.001</w:t>
+            </w:r>
+          </w:p>
+        </w:tc>
+      </w:tr>
+      <w:tr>
+        <w:tc>
+          <w:tcPr/>
+          <w:p>
+            <w:pPr>
+              <w:pStyle w:val="Compact"/>
+            </w:pPr>
+            <w:r>
+              <w:t xml:space="preserve">Leave out Chandpur</w:t>
+            </w:r>
+          </w:p>
+        </w:tc>
+        <w:tc>
+          <w:tcPr/>
+          <w:p>
+            <w:pPr>
+              <w:pStyle w:val="Compact"/>
+            </w:pPr>
+            <w:r>
+              <w:t xml:space="preserve">JRC</w:t>
+            </w:r>
+          </w:p>
+        </w:tc>
+        <w:tc>
+          <w:tcPr/>
+          <w:p>
+            <w:pPr>
+              <w:pStyle w:val="Compact"/>
+            </w:pPr>
+            <w:r>
+              <w:t xml:space="preserve">−4.4</w:t>
+            </w:r>
+          </w:p>
+        </w:tc>
+        <w:tc>
+          <w:tcPr/>
+          <w:p>
+            <w:pPr>
+              <w:pStyle w:val="Compact"/>
+            </w:pPr>
+            <w:r>
+              <w:t xml:space="preserve">0.106</w:t>
+            </w:r>
+          </w:p>
+        </w:tc>
+        <w:tc>
+          <w:tcPr/>
+          <w:p>
+            <w:pPr>
+              <w:pStyle w:val="Compact"/>
+            </w:pPr>
+            <w:r>
+              <w:t xml:space="preserve">0.152</w:t>
+            </w:r>
+          </w:p>
+        </w:tc>
+      </w:tr>
+      <w:tr>
+        <w:tc>
+          <w:tcPr/>
+          <w:p>
+            <w:pPr>
+              <w:pStyle w:val="Compact"/>
+            </w:pPr>
+            <w:r>
               <w:t xml:space="preserve">Flash flood only, 2015–2025</w:t>
             </w:r>
           </w:p>
@@ -12463,7 +12783,1065 @@
         </w:tc>
       </w:tr>
     </w:tbl>
-    <w:bookmarkEnd w:id="70"/>
+    <w:p>
+      <w:pPr>
+        <w:pStyle w:val="BodyText"/>
+      </w:pPr>
+      <w:r>
+        <w:t xml:space="preserve">Table A.3. The 18 data checks run before any model, from</w:t>
+      </w:r>
+      <w:r>
+        <w:t xml:space="preserve"> </w:t>
+      </w:r>
+      <w:r>
+        <w:rPr>
+          <w:rStyle w:val="VerbatimChar"/>
+        </w:rPr>
+        <w:t xml:space="preserve">outputs/validation_variables.csv</w:t>
+      </w:r>
+      <w:r>
+        <w:t xml:space="preserve">.</w:t>
+      </w:r>
+    </w:p>
+    <w:tbl>
+      <w:tblPr>
+        <w:tblStyle w:val="Table"/>
+        <w:tblW w:type="pct" w:w="5000"/>
+        <w:tblLayout w:type="fixed"/>
+        <w:tblLook w:firstRow="1" w:lastRow="0" w:firstColumn="0" w:lastColumn="0" w:noHBand="0" w:noVBand="0" w:val="0020"/>
+      </w:tblPr>
+      <w:tblGrid>
+        <w:gridCol w:w="3321"/>
+        <w:gridCol w:w="3321"/>
+        <w:gridCol w:w="1277"/>
+      </w:tblGrid>
+      <w:tr>
+        <w:trPr>
+          <w:tblHeader w:val="on"/>
+        </w:trPr>
+        <w:tc>
+          <w:tcPr/>
+          <w:p>
+            <w:pPr>
+              <w:pStyle w:val="Compact"/>
+            </w:pPr>
+            <w:r>
+              <w:t xml:space="preserve">Check</w:t>
+            </w:r>
+          </w:p>
+        </w:tc>
+        <w:tc>
+          <w:tcPr/>
+          <w:p>
+            <w:pPr>
+              <w:pStyle w:val="Compact"/>
+            </w:pPr>
+            <w:r>
+              <w:t xml:space="preserve">Observed</w:t>
+            </w:r>
+          </w:p>
+        </w:tc>
+        <w:tc>
+          <w:tcPr/>
+          <w:p>
+            <w:pPr>
+              <w:pStyle w:val="Compact"/>
+            </w:pPr>
+            <w:r>
+              <w:t xml:space="preserve">Result</w:t>
+            </w:r>
+          </w:p>
+        </w:tc>
+      </w:tr>
+      <w:tr>
+        <w:tc>
+          <w:tcPr/>
+          <w:p>
+            <w:pPr>
+              <w:pStyle w:val="Compact"/>
+            </w:pPr>
+            <w:r>
+              <w:t xml:space="preserve">Gold panel matches the archived panel</w:t>
+            </w:r>
+          </w:p>
+        </w:tc>
+        <w:tc>
+          <w:tcPr/>
+          <w:p>
+            <w:pPr>
+              <w:pStyle w:val="Compact"/>
+            </w:pPr>
+            <w:r>
+              <w:t xml:space="preserve">5cbaeb1edaef</w:t>
+            </w:r>
+          </w:p>
+        </w:tc>
+        <w:tc>
+          <w:tcPr/>
+          <w:p>
+            <w:pPr>
+              <w:pStyle w:val="Compact"/>
+            </w:pPr>
+            <w:r>
+              <w:t xml:space="preserve">Pass</w:t>
+            </w:r>
+          </w:p>
+        </w:tc>
+      </w:tr>
+      <w:tr>
+        <w:tc>
+          <w:tcPr/>
+          <w:p>
+            <w:pPr>
+              <w:pStyle w:val="Compact"/>
+            </w:pPr>
+            <w:r>
+              <w:t xml:space="preserve">Boro mask and crop loss: 64 districts in every year, no missing value</w:t>
+            </w:r>
+          </w:p>
+        </w:tc>
+        <w:tc>
+          <w:tcPr/>
+          <w:p>
+            <w:pPr>
+              <w:pStyle w:val="Compact"/>
+            </w:pPr>
+            <w:r>
+              <w:t xml:space="preserve">960 rows</w:t>
+            </w:r>
+          </w:p>
+        </w:tc>
+        <w:tc>
+          <w:tcPr/>
+          <w:p>
+            <w:pPr>
+              <w:pStyle w:val="Compact"/>
+            </w:pPr>
+            <w:r>
+              <w:t xml:space="preserve">Pass</w:t>
+            </w:r>
+          </w:p>
+        </w:tc>
+      </w:tr>
+      <w:tr>
+        <w:tc>
+          <w:tcPr/>
+          <w:p>
+            <w:pPr>
+              <w:pStyle w:val="Compact"/>
+            </w:pPr>
+            <w:r>
+              <w:t xml:space="preserve">Weather: 64 districts in every year, no missing value</w:t>
+            </w:r>
+          </w:p>
+        </w:tc>
+        <w:tc>
+          <w:tcPr/>
+          <w:p>
+            <w:pPr>
+              <w:pStyle w:val="Compact"/>
+            </w:pPr>
+            <w:r>
+              <w:t xml:space="preserve">960 rows</w:t>
+            </w:r>
+          </w:p>
+        </w:tc>
+        <w:tc>
+          <w:tcPr/>
+          <w:p>
+            <w:pPr>
+              <w:pStyle w:val="Compact"/>
+            </w:pPr>
+            <w:r>
+              <w:t xml:space="preserve">Pass</w:t>
+            </w:r>
+          </w:p>
+        </w:tc>
+      </w:tr>
+      <w:tr>
+        <w:tc>
+          <w:tcPr/>
+          <w:p>
+            <w:pPr>
+              <w:pStyle w:val="Compact"/>
+            </w:pPr>
+            <w:r>
+              <w:t xml:space="preserve">NDVI windows: 64 districts in every year, no missing value</w:t>
+            </w:r>
+          </w:p>
+        </w:tc>
+        <w:tc>
+          <w:tcPr/>
+          <w:p>
+            <w:pPr>
+              <w:pStyle w:val="Compact"/>
+            </w:pPr>
+            <w:r>
+              <w:t xml:space="preserve">960 rows</w:t>
+            </w:r>
+          </w:p>
+        </w:tc>
+        <w:tc>
+          <w:tcPr/>
+          <w:p>
+            <w:pPr>
+              <w:pStyle w:val="Compact"/>
+            </w:pPr>
+            <w:r>
+              <w:t xml:space="preserve">Pass</w:t>
+            </w:r>
+          </w:p>
+        </w:tc>
+      </w:tr>
+      <w:tr>
+        <w:tc>
+          <w:tcPr/>
+          <w:p>
+            <w:pPr>
+              <w:pStyle w:val="Compact"/>
+            </w:pPr>
+            <w:r>
+              <w:t xml:space="preserve">Sentinel-1 scene counts: 64 districts in every year, no missing value</w:t>
+            </w:r>
+          </w:p>
+        </w:tc>
+        <w:tc>
+          <w:tcPr/>
+          <w:p>
+            <w:pPr>
+              <w:pStyle w:val="Compact"/>
+            </w:pPr>
+            <w:r>
+              <w:t xml:space="preserve">704 rows</w:t>
+            </w:r>
+          </w:p>
+        </w:tc>
+        <w:tc>
+          <w:tcPr/>
+          <w:p>
+            <w:pPr>
+              <w:pStyle w:val="Compact"/>
+            </w:pPr>
+            <w:r>
+              <w:t xml:space="preserve">Pass</w:t>
+            </w:r>
+          </w:p>
+        </w:tc>
+      </w:tr>
+      <w:tr>
+        <w:tc>
+          <w:tcPr/>
+          <w:p>
+            <w:pPr>
+              <w:pStyle w:val="Compact"/>
+            </w:pPr>
+            <w:r>
+              <w:t xml:space="preserve">Sentinel-1 flood: 64 districts in every year, no missing value</w:t>
+            </w:r>
+          </w:p>
+        </w:tc>
+        <w:tc>
+          <w:tcPr/>
+          <w:p>
+            <w:pPr>
+              <w:pStyle w:val="Compact"/>
+            </w:pPr>
+            <w:r>
+              <w:t xml:space="preserve">704 rows</w:t>
+            </w:r>
+          </w:p>
+        </w:tc>
+        <w:tc>
+          <w:tcPr/>
+          <w:p>
+            <w:pPr>
+              <w:pStyle w:val="Compact"/>
+            </w:pPr>
+            <w:r>
+              <w:t xml:space="preserve">Pass</w:t>
+            </w:r>
+          </w:p>
+        </w:tc>
+      </w:tr>
+      <w:tr>
+        <w:tc>
+          <w:tcPr/>
+          <w:p>
+            <w:pPr>
+              <w:pStyle w:val="Compact"/>
+            </w:pPr>
+            <w:r>
+              <w:t xml:space="preserve">JRC flood: 64 districts in every year, no missing value</w:t>
+            </w:r>
+          </w:p>
+        </w:tc>
+        <w:tc>
+          <w:tcPr/>
+          <w:p>
+            <w:pPr>
+              <w:pStyle w:val="Compact"/>
+            </w:pPr>
+            <w:r>
+              <w:t xml:space="preserve">704 rows</w:t>
+            </w:r>
+          </w:p>
+        </w:tc>
+        <w:tc>
+          <w:tcPr/>
+          <w:p>
+            <w:pPr>
+              <w:pStyle w:val="Compact"/>
+            </w:pPr>
+            <w:r>
+              <w:t xml:space="preserve">Pass</w:t>
+            </w:r>
+          </w:p>
+        </w:tc>
+      </w:tr>
+      <w:tr>
+        <w:tc>
+          <w:tcPr/>
+          <w:p>
+            <w:pPr>
+              <w:pStyle w:val="Compact"/>
+            </w:pPr>
+            <w:r>
+              <w:t xml:space="preserve">Sentinel-1 thresholds: 64 districts in every year, no missing value</w:t>
+            </w:r>
+          </w:p>
+        </w:tc>
+        <w:tc>
+          <w:tcPr/>
+          <w:p>
+            <w:pPr>
+              <w:pStyle w:val="Compact"/>
+            </w:pPr>
+            <w:r>
+              <w:t xml:space="preserve">704 rows</w:t>
+            </w:r>
+          </w:p>
+        </w:tc>
+        <w:tc>
+          <w:tcPr/>
+          <w:p>
+            <w:pPr>
+              <w:pStyle w:val="Compact"/>
+            </w:pPr>
+            <w:r>
+              <w:t xml:space="preserve">Pass</w:t>
+            </w:r>
+          </w:p>
+        </w:tc>
+      </w:tr>
+      <w:tr>
+        <w:tc>
+          <w:tcPr/>
+          <w:p>
+            <w:pPr>
+              <w:pStyle w:val="Compact"/>
+            </w:pPr>
+            <w:r>
+              <w:t xml:space="preserve">S1_flash_wd reproduces the panel’s s1_flash_flood</w:t>
+            </w:r>
+          </w:p>
+        </w:tc>
+        <w:tc>
+          <w:tcPr/>
+          <w:p>
+            <w:pPr>
+              <w:pStyle w:val="Compact"/>
+            </w:pPr>
+            <w:r>
+              <w:t xml:space="preserve">max difference 1.11e-16, n=704</w:t>
+            </w:r>
+          </w:p>
+        </w:tc>
+        <w:tc>
+          <w:tcPr/>
+          <w:p>
+            <w:pPr>
+              <w:pStyle w:val="Compact"/>
+            </w:pPr>
+            <w:r>
+              <w:t xml:space="preserve">Pass</w:t>
+            </w:r>
+          </w:p>
+        </w:tc>
+      </w:tr>
+      <w:tr>
+        <w:tc>
+          <w:tcPr/>
+          <w:p>
+            <w:pPr>
+              <w:pStyle w:val="Compact"/>
+            </w:pPr>
+            <w:r>
+              <w:t xml:space="preserve">S1_monsoon_wd reproduces the panel’s s1_monsoon_flood</w:t>
+            </w:r>
+          </w:p>
+        </w:tc>
+        <w:tc>
+          <w:tcPr/>
+          <w:p>
+            <w:pPr>
+              <w:pStyle w:val="Compact"/>
+            </w:pPr>
+            <w:r>
+              <w:t xml:space="preserve">max difference 1.11e-16, n=640</w:t>
+            </w:r>
+          </w:p>
+        </w:tc>
+        <w:tc>
+          <w:tcPr/>
+          <w:p>
+            <w:pPr>
+              <w:pStyle w:val="Compact"/>
+            </w:pPr>
+            <w:r>
+              <w:t xml:space="preserve">Pass</w:t>
+            </w:r>
+          </w:p>
+        </w:tc>
+      </w:tr>
+      <w:tr>
+        <w:tc>
+          <w:tcPr/>
+          <w:p>
+            <w:pPr>
+              <w:pStyle w:val="Compact"/>
+            </w:pPr>
+            <w:r>
+              <w:t xml:space="preserve">Jrc_flash_wd reproduces the panel’s jrc_flash_flood</w:t>
+            </w:r>
+          </w:p>
+        </w:tc>
+        <w:tc>
+          <w:tcPr/>
+          <w:p>
+            <w:pPr>
+              <w:pStyle w:val="Compact"/>
+            </w:pPr>
+            <w:r>
+              <w:t xml:space="preserve">max difference 4.08e-10, n=704</w:t>
+            </w:r>
+          </w:p>
+        </w:tc>
+        <w:tc>
+          <w:tcPr/>
+          <w:p>
+            <w:pPr>
+              <w:pStyle w:val="Compact"/>
+            </w:pPr>
+            <w:r>
+              <w:t xml:space="preserve">Pass</w:t>
+            </w:r>
+          </w:p>
+        </w:tc>
+      </w:tr>
+      <w:tr>
+        <w:tc>
+          <w:tcPr/>
+          <w:p>
+            <w:pPr>
+              <w:pStyle w:val="Compact"/>
+            </w:pPr>
+            <w:r>
+              <w:t xml:space="preserve">Jrc_monsoon_wd reproduces the panel’s jrc_monsoon_flood</w:t>
+            </w:r>
+          </w:p>
+        </w:tc>
+        <w:tc>
+          <w:tcPr/>
+          <w:p>
+            <w:pPr>
+              <w:pStyle w:val="Compact"/>
+            </w:pPr>
+            <w:r>
+              <w:t xml:space="preserve">max difference 7.75e-10, n=704</w:t>
+            </w:r>
+          </w:p>
+        </w:tc>
+        <w:tc>
+          <w:tcPr/>
+          <w:p>
+            <w:pPr>
+              <w:pStyle w:val="Compact"/>
+            </w:pPr>
+            <w:r>
+              <w:t xml:space="preserve">Pass</w:t>
+            </w:r>
+          </w:p>
+        </w:tc>
+      </w:tr>
+      <w:tr>
+        <w:tc>
+          <w:tcPr/>
+          <w:p>
+            <w:pPr>
+              <w:pStyle w:val="Compact"/>
+            </w:pPr>
+            <w:r>
+              <w:t xml:space="preserve">All fractions lie between 0 and 1</w:t>
+            </w:r>
+          </w:p>
+        </w:tc>
+        <w:tc>
+          <w:tcPr/>
+          <w:p>
+            <w:pPr>
+              <w:pStyle w:val="Compact"/>
+            </w:pPr>
+            <w:r>
+              <w:t xml:space="preserve">0.0000 to 1.0000</w:t>
+            </w:r>
+          </w:p>
+        </w:tc>
+        <w:tc>
+          <w:tcPr/>
+          <w:p>
+            <w:pPr>
+              <w:pStyle w:val="Compact"/>
+            </w:pPr>
+            <w:r>
+              <w:t xml:space="preserve">Pass</w:t>
+            </w:r>
+          </w:p>
+        </w:tc>
+      </w:tr>
+      <w:tr>
+        <w:tc>
+          <w:tcPr/>
+          <w:p>
+            <w:pPr>
+              <w:pStyle w:val="Compact"/>
+            </w:pPr>
+            <w:r>
+              <w:t xml:space="preserve">Boro land never exceeds district area</w:t>
+            </w:r>
+          </w:p>
+        </w:tc>
+        <w:tc>
+          <w:tcPr/>
+          <w:p>
+            <w:pPr>
+              <w:pStyle w:val="Compact"/>
+            </w:pPr>
+            <w:r>
+              <w:t xml:space="preserve">largest share 0.74</w:t>
+            </w:r>
+          </w:p>
+        </w:tc>
+        <w:tc>
+          <w:tcPr/>
+          <w:p>
+            <w:pPr>
+              <w:pStyle w:val="Compact"/>
+            </w:pPr>
+            <w:r>
+              <w:t xml:space="preserve">Pass</w:t>
+            </w:r>
+          </w:p>
+        </w:tc>
+      </w:tr>
+      <w:tr>
+        <w:tc>
+          <w:tcPr/>
+          <w:p>
+            <w:pPr>
+              <w:pStyle w:val="Compact"/>
+            </w:pPr>
+            <w:r>
+              <w:t xml:space="preserve">Sentinel-1 scenes exist in every district-year</w:t>
+            </w:r>
+          </w:p>
+        </w:tc>
+        <w:tc>
+          <w:tcPr/>
+          <w:p>
+            <w:pPr>
+              <w:pStyle w:val="Compact"/>
+            </w:pPr>
+            <w:r>
+              <w:t xml:space="preserve">minimum 5 in Apr-May</w:t>
+            </w:r>
+          </w:p>
+        </w:tc>
+        <w:tc>
+          <w:tcPr/>
+          <w:p>
+            <w:pPr>
+              <w:pStyle w:val="Compact"/>
+            </w:pPr>
+            <w:r>
+              <w:t xml:space="preserve">Pass</w:t>
+            </w:r>
+          </w:p>
+        </w:tc>
+      </w:tr>
+      <w:tr>
+        <w:tc>
+          <w:tcPr/>
+          <w:p>
+            <w:pPr>
+              <w:pStyle w:val="Compact"/>
+            </w:pPr>
+            <w:r>
+              <w:t xml:space="preserve">Satellite crop loss is observed on most Boro land</w:t>
+            </w:r>
+          </w:p>
+        </w:tc>
+        <w:tc>
+          <w:tcPr/>
+          <w:p>
+            <w:pPr>
+              <w:pStyle w:val="Compact"/>
+            </w:pPr>
+            <w:r>
+              <w:t xml:space="preserve">minimum valid share 0.67</w:t>
+            </w:r>
+          </w:p>
+        </w:tc>
+        <w:tc>
+          <w:tcPr/>
+          <w:p>
+            <w:pPr>
+              <w:pStyle w:val="Compact"/>
+            </w:pPr>
+            <w:r>
+              <w:t xml:space="preserve">Pass</w:t>
+            </w:r>
+          </w:p>
+        </w:tc>
+      </w:tr>
+      <w:tr>
+        <w:tc>
+          <w:tcPr/>
+          <w:p>
+            <w:pPr>
+              <w:pStyle w:val="Compact"/>
+            </w:pPr>
+            <w:r>
+              <w:t xml:space="preserve">Yearly mask agrees with BBS area between districts</w:t>
+            </w:r>
+          </w:p>
+        </w:tc>
+        <w:tc>
+          <w:tcPr/>
+          <w:p>
+            <w:pPr>
+              <w:pStyle w:val="Compact"/>
+            </w:pPr>
+            <w:r>
+              <w:t xml:space="preserve">r = 0.914</w:t>
+            </w:r>
+          </w:p>
+        </w:tc>
+        <w:tc>
+          <w:tcPr/>
+          <w:p>
+            <w:pPr>
+              <w:pStyle w:val="Compact"/>
+            </w:pPr>
+            <w:r>
+              <w:t xml:space="preserve">Pass</w:t>
+            </w:r>
+          </w:p>
+        </w:tc>
+      </w:tr>
+      <w:tr>
+        <w:tc>
+          <w:tcPr/>
+          <w:p>
+            <w:pPr>
+              <w:pStyle w:val="Compact"/>
+            </w:pPr>
+            <w:r>
+              <w:t xml:space="preserve">Stable mask agrees with BBS area between districts</w:t>
+            </w:r>
+          </w:p>
+        </w:tc>
+        <w:tc>
+          <w:tcPr/>
+          <w:p>
+            <w:pPr>
+              <w:pStyle w:val="Compact"/>
+            </w:pPr>
+            <w:r>
+              <w:t xml:space="preserve">r = 0.909</w:t>
+            </w:r>
+          </w:p>
+        </w:tc>
+        <w:tc>
+          <w:tcPr/>
+          <w:p>
+            <w:pPr>
+              <w:pStyle w:val="Compact"/>
+            </w:pPr>
+            <w:r>
+              <w:t xml:space="preserve">Pass</w:t>
+            </w:r>
+          </w:p>
+        </w:tc>
+      </w:tr>
+    </w:tbl>
+    <w:bookmarkEnd w:id="71"/>
+    <w:bookmarkStart w:id="72" w:name="appendix-b.-literature-search"/>
+    <w:p>
+      <w:pPr>
+        <w:pStyle w:val="Heading1"/>
+      </w:pPr>
+      <w:r>
+        <w:t xml:space="preserve">Appendix B. Literature search</w:t>
+      </w:r>
+    </w:p>
+    <w:p>
+      <w:pPr>
+        <w:pStyle w:val="FirstParagraph"/>
+      </w:pPr>
+      <w:r>
+        <w:t xml:space="preserve">The search used one database, OpenAlex, on 31 October 2026, with the 52 search strings in Table B.1 and up to 40 records for each of the first 38 strings and 25 for the other 14. This gave 1,870 records, of which 1,383 were unique and 1,232 had an abstract. Screening used titles and abstracts: 421 records concerned Bangladesh or the haor and crops, 182 of them also concerned flooding, and 5 of those also mentioned cultivated or harvested area. Hassan (2019) was found by a separate web search. The core list of 57 papers was confirmed on Crossref. Journals published in Bangladesh are indexed less completely, and keyword screening can miss papers that use other words. The search scripts are in the repository.</w:t>
+      </w:r>
+    </w:p>
+    <w:p>
+      <w:pPr>
+        <w:pStyle w:val="BodyText"/>
+      </w:pPr>
+      <w:r>
+        <w:t xml:space="preserve">Table B.1. Search strings by theme.</w:t>
+      </w:r>
+    </w:p>
+    <w:tbl>
+      <w:tblPr>
+        <w:tblStyle w:val="Table"/>
+        <w:tblW w:type="pct" w:w="5000"/>
+        <w:tblLayout w:type="fixed"/>
+        <w:tblLook w:firstRow="1" w:lastRow="0" w:firstColumn="0" w:lastColumn="0" w:noHBand="0" w:noVBand="0" w:val="0020"/>
+      </w:tblPr>
+      <w:tblGrid>
+        <w:gridCol w:w="3168"/>
+        <w:gridCol w:w="3168"/>
+        <w:gridCol w:w="1584"/>
+      </w:tblGrid>
+      <w:tr>
+        <w:trPr>
+          <w:tblHeader w:val="on"/>
+        </w:trPr>
+        <w:tc>
+          <w:tcPr/>
+          <w:p>
+            <w:pPr>
+              <w:pStyle w:val="Compact"/>
+            </w:pPr>
+            <w:r>
+              <w:t xml:space="preserve">Theme</w:t>
+            </w:r>
+          </w:p>
+        </w:tc>
+        <w:tc>
+          <w:tcPr/>
+          <w:p>
+            <w:pPr>
+              <w:pStyle w:val="Compact"/>
+            </w:pPr>
+            <w:r>
+              <w:t xml:space="preserve">Search strings</w:t>
+            </w:r>
+          </w:p>
+        </w:tc>
+        <w:tc>
+          <w:tcPr/>
+          <w:p>
+            <w:pPr>
+              <w:pStyle w:val="Compact"/>
+            </w:pPr>
+            <w:r>
+              <w:t xml:space="preserve">Records retrieved</w:t>
+            </w:r>
+          </w:p>
+        </w:tc>
+      </w:tr>
+      <w:tr>
+        <w:tc>
+          <w:tcPr/>
+          <w:p>
+            <w:pPr>
+              <w:pStyle w:val="Compact"/>
+            </w:pPr>
+            <w:r>
+              <w:t xml:space="preserve">Haor and Boro flooding</w:t>
+            </w:r>
+          </w:p>
+        </w:tc>
+        <w:tc>
+          <w:tcPr/>
+          <w:p>
+            <w:pPr>
+              <w:pStyle w:val="Compact"/>
+            </w:pPr>
+            <w:r>
+              <w:t xml:space="preserve">haor flash flood Boro rice; flash flood rice Bangladesh damage; Boro rice flood loss Bangladesh; haor basin remote sensing flood; 2017 flash flood Bangladesh haor; haor agriculture climate vulnerability; pre-monsoon flood Bangladesh rice; flood damage rice production Bangladesh district</w:t>
+            </w:r>
+          </w:p>
+        </w:tc>
+        <w:tc>
+          <w:tcPr/>
+          <w:p>
+            <w:pPr>
+              <w:pStyle w:val="Compact"/>
+            </w:pPr>
+            <w:r>
+              <w:t xml:space="preserve">320</w:t>
+            </w:r>
+          </w:p>
+        </w:tc>
+      </w:tr>
+      <w:tr>
+        <w:tc>
+          <w:tcPr/>
+          <w:p>
+            <w:pPr>
+              <w:pStyle w:val="Compact"/>
+            </w:pPr>
+            <w:r>
+              <w:t xml:space="preserve">Area versus yield</w:t>
+            </w:r>
+          </w:p>
+        </w:tc>
+        <w:tc>
+          <w:tcPr/>
+          <w:p>
+            <w:pPr>
+              <w:pStyle w:val="Compact"/>
+            </w:pPr>
+            <w:r>
+              <w:t xml:space="preserve">harvested area yield decomposition extreme weather crop production; flood impact crop production harvested area yield; weather shocks harvested area abandonment panel; extreme weather disasters global crop production; climate variability harvested area versus yield; flood crop loss panel fixed effects; crop yield harvested area response flood</w:t>
+            </w:r>
+          </w:p>
+        </w:tc>
+        <w:tc>
+          <w:tcPr/>
+          <w:p>
+            <w:pPr>
+              <w:pStyle w:val="Compact"/>
+            </w:pPr>
+            <w:r>
+              <w:t xml:space="preserve">280</w:t>
+            </w:r>
+          </w:p>
+        </w:tc>
+      </w:tr>
+      <w:tr>
+        <w:tc>
+          <w:tcPr/>
+          <w:p>
+            <w:pPr>
+              <w:pStyle w:val="Compact"/>
+            </w:pPr>
+            <w:r>
+              <w:t xml:space="preserve">Climate and yield in Bangladesh</w:t>
+            </w:r>
+          </w:p>
+        </w:tc>
+        <w:tc>
+          <w:tcPr/>
+          <w:p>
+            <w:pPr>
+              <w:pStyle w:val="Compact"/>
+            </w:pPr>
+            <w:r>
+              <w:t xml:space="preserve">climate change rice yield Bangladesh panel; Boro rice yield temperature Bangladesh; heat stress Boro rice Bangladesh; district level rice yield climate Bangladesh; climate rice production Bangladesh econometric</w:t>
+            </w:r>
+          </w:p>
+        </w:tc>
+        <w:tc>
+          <w:tcPr/>
+          <w:p>
+            <w:pPr>
+              <w:pStyle w:val="Compact"/>
+            </w:pPr>
+            <w:r>
+              <w:t xml:space="preserve">200</w:t>
+            </w:r>
+          </w:p>
+        </w:tc>
+      </w:tr>
+      <w:tr>
+        <w:tc>
+          <w:tcPr/>
+          <w:p>
+            <w:pPr>
+              <w:pStyle w:val="Compact"/>
+            </w:pPr>
+            <w:r>
+              <w:t xml:space="preserve">Flood mapping and crop loss from satellites</w:t>
+            </w:r>
+          </w:p>
+        </w:tc>
+        <w:tc>
+          <w:tcPr/>
+          <w:p>
+            <w:pPr>
+              <w:pStyle w:val="Compact"/>
+            </w:pPr>
+            <w:r>
+              <w:t xml:space="preserve">Sentinel-1 flood mapping Bangladesh; Sentinel-1 flood rice damage assessment; satellite crop loss flood NDVI change rice; remote sensing flood damage cropland rice; JRC Global Surface Water flood agriculture; SAR water threshold flood mapping rice paddy</w:t>
+            </w:r>
+          </w:p>
+        </w:tc>
+        <w:tc>
+          <w:tcPr/>
+          <w:p>
+            <w:pPr>
+              <w:pStyle w:val="Compact"/>
+            </w:pPr>
+            <w:r>
+              <w:t xml:space="preserve">240</w:t>
+            </w:r>
+          </w:p>
+        </w:tc>
+      </w:tr>
+      <w:tr>
+        <w:tc>
+          <w:tcPr/>
+          <w:p>
+            <w:pPr>
+              <w:pStyle w:val="Compact"/>
+            </w:pPr>
+            <w:r>
+              <w:t xml:space="preserve">Vulnerability indices and spatial methods</w:t>
+            </w:r>
+          </w:p>
+        </w:tc>
+        <w:tc>
+          <w:tcPr/>
+          <w:p>
+            <w:pPr>
+              <w:pStyle w:val="Compact"/>
+            </w:pPr>
+            <w:r>
+              <w:t xml:space="preserve">agricultural vulnerability index Bangladesh; composite indicator uncertainty sensitivity analysis; social vulnerability index uncertainty sensitivity; spatial autocorrelation crop yield LISA; climate vulnerability exposure sensitivity adaptive capacity agriculture Bangladesh</w:t>
+            </w:r>
+          </w:p>
+        </w:tc>
+        <w:tc>
+          <w:tcPr/>
+          <w:p>
+            <w:pPr>
+              <w:pStyle w:val="Compact"/>
+            </w:pPr>
+            <w:r>
+              <w:t xml:space="preserve">200</w:t>
+            </w:r>
+          </w:p>
+        </w:tc>
+      </w:tr>
+      <w:tr>
+        <w:tc>
+          <w:tcPr/>
+          <w:p>
+            <w:pPr>
+              <w:pStyle w:val="Compact"/>
+            </w:pPr>
+            <w:r>
+              <w:t xml:space="preserve">NDVI and yield</w:t>
+            </w:r>
+          </w:p>
+        </w:tc>
+        <w:tc>
+          <w:tcPr/>
+          <w:p>
+            <w:pPr>
+              <w:pStyle w:val="Compact"/>
+            </w:pPr>
+            <w:r>
+              <w:t xml:space="preserve">NDVI rice yield Bangladesh; NDVI yield relationship within field interannual irrigated rice; satellite crop yield estimation smallholder district statistics</w:t>
+            </w:r>
+          </w:p>
+        </w:tc>
+        <w:tc>
+          <w:tcPr/>
+          <w:p>
+            <w:pPr>
+              <w:pStyle w:val="Compact"/>
+            </w:pPr>
+            <w:r>
+              <w:t xml:space="preserve">120</w:t>
+            </w:r>
+          </w:p>
+        </w:tc>
+      </w:tr>
+      <w:tr>
+        <w:tc>
+          <w:tcPr/>
+          <w:p>
+            <w:pPr>
+              <w:pStyle w:val="Compact"/>
+            </w:pPr>
+            <w:r>
+              <w:t xml:space="preserve">Adaptation</w:t>
+            </w:r>
+          </w:p>
+        </w:tc>
+        <w:tc>
+          <w:tcPr/>
+          <w:p>
+            <w:pPr>
+              <w:pStyle w:val="Compact"/>
+            </w:pPr>
+            <w:r>
+              <w:t xml:space="preserve">short duration Boro rice variety flash flood haor; flood early warning haor farmers; crop insurance flood Bangladesh rice; submergence tolerant rice Bangladesh adoption</w:t>
+            </w:r>
+          </w:p>
+        </w:tc>
+        <w:tc>
+          <w:tcPr/>
+          <w:p>
+            <w:pPr>
+              <w:pStyle w:val="Compact"/>
+            </w:pPr>
+            <w:r>
+              <w:t xml:space="preserve">160</w:t>
+            </w:r>
+          </w:p>
+        </w:tc>
+      </w:tr>
+      <w:tr>
+        <w:tc>
+          <w:tcPr/>
+          <w:p>
+            <w:pPr>
+              <w:pStyle w:val="Compact"/>
+            </w:pPr>
+            <w:r>
+              <w:t xml:space="preserve">Targeted search</w:t>
+            </w:r>
+          </w:p>
+        </w:tc>
+        <w:tc>
+          <w:tcPr/>
+          <w:p>
+            <w:pPr>
+              <w:pStyle w:val="Compact"/>
+            </w:pPr>
+            <w:r>
+              <w:t xml:space="preserve">effects of flood on agricultural productivity in Bangladesh; satellites self-reports submersion floods Bangladesh; flood rice Bangladesh difference-in-differences; flood exposure agricultural production Bangladesh district panel; Boro production loss 2017 flash flood district statistics; flash flood early monsoon haor rice production estimate; Boro rice mapping Bangladesh satellite annual; rice area mapping Bangladesh Sentinel-1 MODIS; annual paddy rice map South Asia 10 m; pre-monsoon flood Meghna basin trend haor frequency; flood positive effect dry season rice residual moisture sediment Bangladesh; India district flood rice yield panel; flood harvested area rice Vietnam Thailand Philippines panel; typhoon rice production harvested area panel</w:t>
+            </w:r>
+          </w:p>
+        </w:tc>
+        <w:tc>
+          <w:tcPr/>
+          <w:p>
+            <w:pPr>
+              <w:pStyle w:val="Compact"/>
+            </w:pPr>
+            <w:r>
+              <w:t xml:space="preserve">350</w:t>
+            </w:r>
+          </w:p>
+        </w:tc>
+      </w:tr>
+    </w:tbl>
+    <w:bookmarkEnd w:id="72"/>
     <w:sectPr>
       <w:pgSz w:h="15840" w:w="12240"/>
       <w:pgMar w:bottom="1440" w:footer="708" w:gutter="0" w:header="708" w:left="1440" w:right="1440" w:top="1440"/>

</xml_diff>

<commit_message>
Apply the third review: printed totals, page references, attribution and figure rows
</commit_message>
<xml_diff>
--- a/paper/Manuscript.docx
+++ b/paper/Manuscript.docx
@@ -266,7 +266,7 @@
         <w:pStyle w:val="FirstParagraph"/>
       </w:pPr>
       <w:r>
-        <w:t xml:space="preserve">These studies differ in what they show. Climate studies describe yield responses, damage studies describe single events, and adaptation studies describe how farmers respond, so few bear directly on whether a loss appears in harvested area or in yield. Table 1 compares the closest studies with this one. We found no study that uses a multi-year district panel with satellite flood data to split Boro flash-flood losses into harvested area and yield. This rests on a documented search of 1,383 records, screened on titles and abstracts (Appendix B). A recent study addresses monsoon flood disasters and crop production in Bangladesh (Rahman et al., 2025).</w:t>
+        <w:t xml:space="preserve">These studies differ in what they show. Climate studies describe yield responses, damage studies describe single events, and adaptation studies describe how farmers respond, so few bear directly on whether a loss appears in harvested area or in yield. Table 1 compares the closest studies with this one. We found no study that uses a multi-year district panel with satellite flood data to split Boro flash-flood losses into harvested area and yield. This rests on a documented search of 1,383 records, screened on titles and abstracts (Appendix B). A recent study addresses monsoon flood disasters and crop production in Bangladesh (Rahman et al., 2025); our main question concerns flash floods before harvest.</w:t>
       </w:r>
     </w:p>
     <w:p>
@@ -809,7 +809,7 @@
         <w:pStyle w:val="FirstParagraph"/>
       </w:pPr>
       <w:r>
-        <w:t xml:space="preserve">The analysis uses the panel built and tested in the framework paper (Mumu and Karim, 2026a) and archived separately (Mumu and Karim, 2026b): 960 district-years for all 64 districts and harvest years 2011–2025, where harvest year t is the crop sown in November of t−1 and harvested in April–May of t. Boro harvested area, yield and production are values printed in the BBS yearbooks, each with its edition and page, and no value is modelled or filled. Weather comes from ERA5-Land (Muñoz-Sabater et al., 2021). Flood fractions come from the monthly surface water record of the Joint Research Centre (JRC) (Pekel et al., 2016) and from Sentinel-1 radar (Torres et al., 2012), and are kept as separate records. Table 2 lists the sources. The seven haor districts are Sunamganj, Habiganj, Netrokona, Kishoreganj, Sylhet, Moulvibazar and Brahmanbaria, a list fixed before the models were run. They produced 17.5 % of Boro over the period.</w:t>
+        <w:t xml:space="preserve">The analysis uses the panel built and tested in the framework paper (Mumu and Karim, 2026a) and archived separately (Mumu and Karim, 2026b): 960 district-years for all 64 districts and harvest years 2011–2025, where harvest year t is the crop sown in November of t−1 and harvested in April–May of t. Boro harvested area, yield and production are values printed in the BBS yearbooks, each with its edition and page, and no value is modelled or filled. Weather comes from ERA5-Land (Muñoz-Sabater et al., 2021; Copernicus Climate Change Service, 2019). Flood fractions come from the monthly surface water record of the Joint Research Centre (JRC) (Pekel et al., 2016) and from Sentinel-1 radar (Torres et al., 2012), and are kept as separate records. Table 2 lists the sources. The seven haor districts are Sunamganj, Habiganj, Netrokona, Kishoreganj, Sylhet, Moulvibazar and Brahmanbaria, a list fixed before the models were run. They produced 17.5 % of Boro over the period.</w:t>
       </w:r>
     </w:p>
     <w:p>
@@ -1136,7 +1136,7 @@
         <w:pStyle w:val="FirstParagraph"/>
       </w:pPr>
       <w:r>
-        <w:t xml:space="preserve">BBS estimates Boro in three steps (Bangladesh Bureau of Statistics, 2026). Area comes from sample clusters of plots, visited four times a year and expanded to districts by a ratio estimator. Yield comes from crop cuts of 20 m</w:t>
+        <w:t xml:space="preserve">BBS estimates Boro in three steps (Bangladesh Bureau of Statistics, 2026, Sections 1.2.5–1.2.9, pp. 4–6). Area comes from sample clusters of plots, visited four times a year and expanded to districts by a ratio estimator. Yield comes from crop cuts of 20 m</w:t>
       </w:r>
       <w:r>
         <w:rPr>
@@ -3690,7 +3690,7 @@
         <w:pStyle w:val="BodyText"/>
       </w:pPr>
       <w:r>
-        <w:t xml:space="preserve">Two non-haor districts stand out in Fig. 4a, with large changes in BBS area and almost no satellite loss. Patuakhali fell by 43 %, but from a base of under 2,000 ha. Chandpur rose by 67 %: its 2017 area is 110,467 ha, against 64,424 ha in 2015 and 67,733 ha in 2018. This appears to be a duplication in the source: the yearbooks print the same 136,046 acres for both HYV and hybrid Boro, while hybrid area was 12,856 acres the year before and 15,730 acres the year after. We keep the value as printed, and leaving out Chandpur changes little (Table A.1). No check on printed values can detect such a case, because it is repeated in two editions and included in the national total. Both districts show that BBS area can move for reasons other than flood, by as much as the flood signal.</w:t>
+        <w:t xml:space="preserve">Two non-haor districts stand out in Fig. 4a, with large changes in BBS area and almost no satellite loss. Patuakhali fell by 43 %, but from a base of under 2,000 ha. Chandpur rose by 67 %: its 2017 area is 110,467 ha, against 64,424 ha in 2015 and 67,733 ha in 2018. This appears to be a duplication in the source: the yearbooks print the same 136,046 acres for both HYV and hybrid Boro (Bangladesh Bureau of Statistics, 2018, pp. 72–74), while hybrid area was 12,856 acres the year before and 15,730 acres the year after. We keep the value as printed, and leaving out Chandpur changes little (Table A.1). None of the framework’s checks detected it, because it is repeated in two editions and included in the national total; a check on year-to-year jumps, or on the HYV and hybrid components, would flag it. Both districts show that BBS area can move for reasons other than flood, by as much as the flood signal.</w:t>
       </w:r>
     </w:p>
     <w:p>
@@ -4491,7 +4491,7 @@
         <w:pStyle w:val="FirstParagraph"/>
       </w:pPr>
       <w:r>
-        <w:t xml:space="preserve">BBS’s own reports show how the loss was recorded. The yearbook for 2016–17 states that flash flood fully damaged Boro on 296,701 ha (Bangladesh Bureau of Statistics, 2018), and its national Boro area fell by 296,697 ha from the year before. The same report attributes a higher yield to management. Its damage table, for floods in March and April, lists six haor districts (Table 7), where the reported damaged area is close to the fall in BBS harvested area, and its production loss of 865,696 t is close to the 0.88 million t in the literature (Hossain et al., 2023). These reports come from the same agency, so they do not independently confirm the area series, but they show that in 2017 destroyed crop was recorded as lost area and not as lower yield. For the 2016 flood, BBS reported far less: a production loss of 97,592 t, with 28,927 ha damaged in its table and 40,198 ha fully damaged in its crop report (Bangladesh Bureau of Statistics, 2017). That fits the absence of a fall in area in 2016. For 2022 it reported Boro damage only in Netrokona: 3,920 ha and 21,305 t (Bangladesh Bureau of Statistics, 2023). So the two flood years without a fall in harvested area are also years in which BBS reported little Boro damage. Even so, Sunamganj’s reported damage in 2016 (23,411 ha) exceeds its fall in harvested area that year, so reported damage does not always appear in the area series.</w:t>
+        <w:t xml:space="preserve">BBS’s own reports show how the loss was recorded. The yearbook for 2016–17 states that flash flood fully damaged Boro on 296,701 ha (Bangladesh Bureau of Statistics, 2018, p. 68), and its national Boro area fell by 296,697 ha from the year before. The same report attributes a higher yield to management. Its damage table for floods in March and April (Table 4.2.11, p. 349) lists six haor districts (Table 7), where the reported damaged area is close to the fall in BBS harvested area, and its production loss of 865,696 t is close to the 0.88 million t in the literature (Hossain et al., 2023). These reports come from the same agency, so they do not independently confirm the area series, but they show that in 2017 destroyed crop was recorded as lost area and not as lower yield. For the 2016 flood, BBS reported far less: a production loss of 97,592 t, with 28,927 ha damaged in its table (Table 4.2.10, p. 348 of the same yearbook) and 40,198 ha fully damaged in its crop report (Bangladesh Bureau of Statistics, 2017, p. 68). That fits the absence of a fall in area in 2016. For 2022 it reported Boro damage only in Netrokona: 3,920 ha and 21,305 t (Bangladesh Bureau of Statistics, 2023, Table 4.2.8, p. 422). So the two flood years without a fall in harvested area are also years in which BBS reported little Boro damage. Even so, Sunamganj’s reported damage in 2016 (23,411 ha) exceeds its fall in harvested area that year, so reported damage does not always appear in the area series.</w:t>
       </w:r>
     </w:p>
     <w:p>
@@ -4499,7 +4499,7 @@
         <w:pStyle w:val="BodyText"/>
       </w:pPr>
       <w:r>
-        <w:t xml:space="preserve">Table 7. BBS reported damage and the fall in BBS harvested area and production in 2017, against the mean of 2015 and 2018.</w:t>
+        <w:t xml:space="preserve">Table 7. BBS reported damage and the fall in BBS harvested area and production in 2017, against the mean of 2015 and 2018. The last row gives the damage totals printed in the yearbook. The printed district losses add to 865,698 t, and the areas above add to 232,820 ha after rounding.</w:t>
       </w:r>
     </w:p>
     <w:tbl>
@@ -4959,7 +4959,7 @@
               <w:pStyle w:val="Compact"/>
             </w:pPr>
             <w:r>
-              <w:t xml:space="preserve">865,698</w:t>
+              <w:t xml:space="preserve">865,696</w:t>
             </w:r>
           </w:p>
         </w:tc>
@@ -6624,7 +6624,7 @@
       <w:r>
         <w:drawing>
           <wp:inline>
-            <wp:extent cx="5943600" cy="3474633"/>
+            <wp:extent cx="5943600" cy="3898368"/>
             <wp:effectExtent b="0" l="0" r="0" t="0"/>
             <wp:docPr descr="" title="" id="46" name="Picture"/>
             <a:graphic>
@@ -6645,7 +6645,7 @@
                   <pic:spPr bwMode="auto">
                     <a:xfrm>
                       <a:off x="0" y="0"/>
-                      <a:ext cx="5943600" cy="3474633"/>
+                      <a:ext cx="5943600" cy="3898368"/>
                     </a:xfrm>
                     <a:prstGeom prst="rect">
                       <a:avLst/>
@@ -10828,7 +10828,7 @@
         <w:pStyle w:val="FirstParagraph"/>
       </w:pPr>
       <w:r>
-        <w:t xml:space="preserve">One claim is strongly supported as a description of a single event. In the 2017 flood, the loss in BBS statistics appeared in harvested area and production, and almost none in yield. The three designs agree in direction, in both flood records, although the planned synthetic-control test failed and the JRC estimate depends on 2017. BBS’s own damage reports, a satellite measure that uses no BBS data and published figures point to the same districts and to losses of similar scale, and BBS reported far less Boro damage in 2016 and 2022, when no comparable fall appears. This is strong evidence consistent with flood-related crop destruction, although no single comparison proves that the whole fall in area was caused by the flood.</w:t>
+        <w:t xml:space="preserve">One claim is strongly supported as a description of a single event. In the 2017 flood, the loss in BBS statistics appeared in harvested area and production, and almost none in yield. The dose-response model in both records, the year-by-year comparison and synthetic control agree in direction, although the planned synthetic-control test failed and the JRC estimate depends on 2017. BBS’s own damage reports, a satellite measure that uses no BBS data and published figures point to the same districts and to losses of similar scale, and BBS reported far less Boro damage in 2016 and 2022, when no comparable fall appears. This is strong evidence consistent with flood-related crop destruction, although no single comparison proves that the whole fall in area was caused by the flood.</w:t>
       </w:r>
     </w:p>
     <w:p>
@@ -11017,7 +11017,7 @@
         <w:pStyle w:val="FirstParagraph"/>
       </w:pPr>
       <w:r>
-        <w:t xml:space="preserve">The likely reason is how the statistics are built. BBS estimates yield from crop cuts on plots in fields growing the crop, and area separately (Bangladesh Bureau of Statistics, 2026). Its report for 2016–17 describes flash flood as fully damaging crop on 296,701 ha, its national area fell by the same amount, and it attributes higher yield to management (Bangladesh Bureau of Statistics, 2018). So in 2017 destroyed crop left the area estimate, and the yield estimate reflects the crop that remained. Since Boro is planted before flash floods arrive, a same-season fall in harvested area means crop lost and not a planting decision. The yearbooks do not state this as a general rule, and it cannot be assumed for every year: in 2016, reported damage is not fully visible in area. The small positive yield effect with JRC could mean that weaker fields are lost first, but the evidence for this is thin.</w:t>
+        <w:t xml:space="preserve">The likely reason is how the statistics are built. BBS estimates yield from crop cuts on plots in fields growing the crop, and area separately (Bangladesh Bureau of Statistics, 2026). Its report for 2016–17 describes flash flood as fully damaging crop on 296,701 ha, its national area fell by the same amount, and it attributes higher yield to management (Bangladesh Bureau of Statistics, 2018, p. 68). So in 2017 destroyed crop left the area estimate, and the yield estimate reflects the crop that remained. Since Boro is planted before flash floods arrive, a same-season fall in harvested area means crop lost and not a planting decision. The yearbooks do not state this as a general rule, and it cannot be assumed for every year: in 2016, reported damage is not fully visible in area. The small positive yield effect with JRC could mean that weaker fields are lost first, but the evidence for this is thin.</w:t>
       </w:r>
     </w:p>
     <w:p>
@@ -11216,7 +11216,7 @@
         <w:pStyle w:val="FirstParagraph"/>
       </w:pPr>
       <w:r>
-        <w:t xml:space="preserve">The panel is archived at https://doi.org/10.5281/zenodo.23795046. The derived data remain subject to the terms of their sources. The BBS yearbook PDFs and the GADM v4.1 boundaries (GADM, 2022) are not redistributed and must be obtained from the Bangladesh Bureau of Statistics and gadm.org. Code, notebooks, the analysis plan and the Earth Engine extracts for this paper are in the repository given in the Software and data availability section and archived at https://doi.org/10.5281/zenodo.23829199.</w:t>
+        <w:t xml:space="preserve">The panel is archived at https://doi.org/10.5281/zenodo.23795046. The derived data remain subject to the terms of their sources. Contains modified Copernicus Sentinel data (2014–2025) and modified Copernicus Climate Change Service information (2026). The BBS yearbook PDFs and the GADM v4.1 boundaries (GADM, 2022) are not redistributed and must be obtained from the Bangladesh Bureau of Statistics and gadm.org. Code, notebooks, the analysis plan and the Earth Engine extracts for this paper are in the repository given in the Software and data availability section and archived at https://doi.org/10.5281/zenodo.23829199.</w:t>
       </w:r>
     </w:p>
     <w:bookmarkEnd w:id="70"/>
@@ -11394,6 +11394,14 @@
         <w:pStyle w:val="BodyText"/>
       </w:pPr>
       <w:r>
+        <w:t xml:space="preserve">Copernicus Climate Change Service, 2019. ERA5-Land hourly data from 1950 to present. Copernicus Climate Change Service (C3S) Climate Data Store (CDS). https://doi.org/10.24381/cds.e2161bac</w:t>
+      </w:r>
+    </w:p>
+    <w:p>
+      <w:pPr>
+        <w:pStyle w:val="BodyText"/>
+      </w:pPr>
+      <w:r>
         <w:t xml:space="preserve">Cui, X., 2020. Beyond Yield Response: Weather Shocks and Crop Abandonment. Journal of the Association of Environmental and Resource Economists 7 (5), 901–932. https://doi.org/10.1086/709859</w:t>
       </w:r>
     </w:p>
@@ -11498,7 +11506,7 @@
         <w:pStyle w:val="BodyText"/>
       </w:pPr>
       <w:r>
-        <w:t xml:space="preserve">Jagadish, S., Craufurd, P.Q., Wheeler, T.R., 2007. High temperature stress and spikelet fertility in rice (Oryza sativa L.). Journal of Experimental Botany 58 (7), 1627–1635. https://doi.org/10.1093/jxb/erm003</w:t>
+        <w:t xml:space="preserve">Jagadish, S.V.K., Craufurd, P.Q., Wheeler, T.R., 2007. High temperature stress and spikelet fertility in rice (Oryza sativa L.). Journal of Experimental Botany 58 (7), 1627–1635. https://doi.org/10.1093/jxb/erm003</w:t>
       </w:r>
     </w:p>
     <w:p>
@@ -11514,7 +11522,7 @@
         <w:pStyle w:val="BodyText"/>
       </w:pPr>
       <w:r>
-        <w:t xml:space="preserve">Khan, M., Mia, M.Y., Hossain, M.R., 2012. Impacts of Flood on Crop Production in Haor Areas of Two Upazillas in Kishoregonj. Journal of Environmental Science and Natural Resources 5 (1), 193–198. https://doi.org/10.3329/jesnr.v5i1.11581</w:t>
+        <w:t xml:space="preserve">Khan, M.N.H., Mia, M.Y., Hossain, M.R., 2012. Impacts of Flood on Crop Production in Haor Areas of Two Upazillas in Kishoregonj. Journal of Environmental Science and Natural Resources 5 (1), 193–198. https://doi.org/10.3329/jesnr.v5i1.11581</w:t>
       </w:r>
     </w:p>
     <w:p>
@@ -14500,7 +14508,7 @@
               <w:pStyle w:val="Compact"/>
             </w:pPr>
             <w:r>
-              <w:t xml:space="preserve">Next year’s flash flood (placebo) (Sentinel-1)</w:t>
+              <w:t xml:space="preserve">Next year’s flash flood (Sentinel-1)</w:t>
             </w:r>
           </w:p>
         </w:tc>

</xml_diff>

<commit_message>
Point the paper, citation file and README at the v1.0.1 DOI
</commit_message>
<xml_diff>
--- a/paper/Manuscript.docx
+++ b/paper/Manuscript.docx
@@ -129,7 +129,7 @@
         </w:numPr>
       </w:pPr>
       <w:r>
-        <w:t xml:space="preserve">Code, notebooks and outputs: https://github.com/TasMumu/bd-boro-flood-risk; the version described here is archived on Zenodo at https://doi.org/10.5281/zenodo.23829199</w:t>
+        <w:t xml:space="preserve">Code, notebooks and outputs: https://github.com/TasMumu/bd-boro-flood-risk; the version described here is archived on Zenodo at https://doi.org/10.5281/zenodo.23838852</w:t>
       </w:r>
     </w:p>
     <w:p>
@@ -11216,7 +11216,7 @@
         <w:pStyle w:val="FirstParagraph"/>
       </w:pPr>
       <w:r>
-        <w:t xml:space="preserve">The panel is archived at https://doi.org/10.5281/zenodo.23795046. The derived data remain subject to the terms of their sources. Contains modified Copernicus Sentinel data (2014–2025) and modified Copernicus Climate Change Service information (2026). The BBS yearbook PDFs and the GADM v4.1 boundaries (GADM, 2022) are not redistributed and must be obtained from the Bangladesh Bureau of Statistics and gadm.org. Code, notebooks, the analysis plan and the Earth Engine extracts for this paper are in the repository given in the Software and data availability section and archived at https://doi.org/10.5281/zenodo.23829199.</w:t>
+        <w:t xml:space="preserve">The panel is archived at https://doi.org/10.5281/zenodo.23795046. The derived data remain subject to the terms of their sources. Contains modified Copernicus Sentinel data (2014–2025) and modified Copernicus Climate Change Service information (2026). The BBS yearbook PDFs and the GADM v4.1 boundaries (GADM, 2022) are not redistributed and must be obtained from the Bangladesh Bureau of Statistics and gadm.org. Code, notebooks, the analysis plan and the Earth Engine extracts for this paper are in the repository given in the Software and data availability section and archived at https://doi.org/10.5281/zenodo.23838852.</w:t>
       </w:r>
     </w:p>
     <w:bookmarkEnd w:id="70"/>

</xml_diff>